<commit_message>
v1.1.3 docs: PRD 6.21 web research and arbitration, release notes, docx wrap fix
Co-Authored-By: Claude Opus 5.5 <noreply@anthropic.com>
</commit_message>
<xml_diff>
--- a/PRD.docx
+++ b/PRD.docx
@@ -1888,6 +1888,203 @@
     <w:p>
       <w:r>
         <w:t>Today's Target Accounts data (6.12/6.19) comes entirely from an Excel workbook the user manually gets ChatGPT to deep-research outside the extension, in small iterative chunks - unsustainable for a product intended for distribution/sale to other salespeople, since a new customer shouldn't need ChatGPT or manual Excel work just to reach a usable state. This feature makes the extension able to build that company/contact universe itself. Full phased plan on file (giggly-watching-feather.md); summarized here as work lands. Decided directly with the user: the onboarding wizard's country/region coverage should eventually span LinkedIn's full country list (each needing a live-verified geoUrn, added incrementally - no LinkedIn URL parameter is ever guessed in this codebase, always confirmed live first); discovered companies/contacts merge directly into the same ChatGPT-imported targetAccountsWorkbook (tagged source: "discovered" vs. "imported", dashboards show both together) rather than living in separate storage - revised from an earlier "keep fully separate" decision once the user raised the real near-term case: his own pilot (his wife's sales team, who already has a rich ChatGPT-researched dataset) benefits from one unified view, and a brand-new customer with no ChatGPT workbook at all never pays any cost for that either way; every onboarding step (location, size/cap, industry, priority guidelines, competitor exclusion, recruiter exclusion, company context, ideal customer profile, target-contact titles/keywords) must be completed before a Discovery scan can start, not just the mechanically-necessary ones, since Company Context/ICP also feed the new company-level AI prioritization pass. Planned phases: a required first-run onboarding wizard; a live-verification spike for LinkedIn's company-search size/industry facets and People Search's multi-title/company-scoping support; a resumable multi-day scan queue (company discovery, then per-company contact discovery, paced under 6.20's unified touch budget, no chrome.alarms - always a deliberate “Continue” click); and a lightweight in-extension company-prioritization pass (reusing the existing prioritizeLeads()/tool-call pattern from 6.11, informed by a simple ranked Size/Location/Industry “T-shirt size” priority guideline) so discovered companies get a usable priority without needing ChatGPT's deep research behind them. v0.30.0 shipped the first phase (the unified safety-budget enforcement described in Section 7 below); v0.31.0 shipped the second - the onboarding wizard itself, fully built and tested end-to-end by the user for a real second-team pilot, with company/industry exclusion lists and a real starter set of confirmed countries/industries. Phase 4 (discovery-queue.js, a resumable multi-day scan queue) and Phase 5 (company-discovery-extraction.js/company-discovery-content-script.js, the actual Company Search scan module) are now built, both still only reachable via a temporary debug panel on Settings (no real progress UI yet) pending live testing. Phase 5's design, confirmed live 2026-09-15 against real LinkedIn pages (not guessed): the Companies-only search tab's result cards are directly scraped (p[0]/p[1]/p[2] = name/industry/location within each card's own anchor, same anchor carries a currentCompany= link for the numeric id), pagination is a plain &amp;page=N query param (no clicking/scrolling needed), and a card whose own location text doesn't carry a recognizable country falls back to a structured read of the company's own page (bpr-guid-* embedded JSON - the primary entity is found via its query response's own *elements reference, not just "the first entity with a headquarter field," which was confirmed live to sometimes return an unrelated company). Only a company whose own location confirms a target country is kept (Priority 1, per the plan's tiering); a facet-matched card whose location can't be confirmed either way (Priority 2) is deferred past v1 and simply skipped, not guessed at. Search strategy revised the same day after live testing: a facet-only query (no keyword) ranks results toward "companies you follow"/globally prominent companies regardless of how narrow the facets are - confirmed live, only 3 of the first 10 Switzerland-facet results were genuinely Swiss-HQ'd. Adding the target country's own name as a keywords= term raised that to 9 of 10; the search is now one unit per target country (each with its own keywords=&lt;country&gt; term and its own pagination), not one combined multi-country query. Fourth bug found the same day: a real run showed 37.5% of scraped cards (15 of 40) silently discarded for lacking a LinkedIn numeric id - a card only carries one when there's LinkedIn-network overlap with the viewer. Fixed the same way company-resolve-content-script.js already solved this exact gap months ago: recovering the id from the company's own page (the same visit already made for the location fallback tier, when needed) rather than giving up. Phase 6 (contact-discovery-extraction.js/contact-discovery-content-script.js) is now also built, not yet live-tested. Its real mechanism turned out different from the original sketch: global People Search has no structured Title filter at all, but each company's own LinkedIn People tab has its own keyword search box (linkedin.com/company/&lt;slug&gt;/people/?keywords=&lt;expression&gt;), already scoped to one company - confirmed live against a real 12-candidate result (real, semantic LinkedIn CSS classes, not hashed ones), including that the match is against a person's entire career history, not just their current role (a "Senior Advisor" card matched a "CEO OR CTO" search purely from a past role) - which is why a candidate is only kept once its own displayed headline is independently checked against the target titles/keywords (expanded through a new acronym/full-title alias table, storage.js's TITLE_ALIAS_GROUPS), not trusted from LinkedIn's own match alone. Ships with a configurable max-contacts-per-account (default 10) and exact-title-before-keyword prioritized selection when a company has more qualifying candidates than the cap; a structured preferred-seniority field remains a real to-do. Pagination isn't pursued for v1 (the page's "Page 2..." controls are plain buttons with no URL param, and a real programmatic click on one didn't change the rendered results) - not needed since one company's first screen already routinely exceeds the 10-contact cap. The first real run hit LinkedIn's own "unable to load people insights data" error on every company. First diagnosis (a rendering-timing issue, same class as a Phase 5 bug) was wrong - re-tested after that fix with the same result, then found the real cause by testing a precise range of query lengths live: LinkedIn's People-tab insights backend has a deterministic query-complexity ceiling - 6 boolean OR-clauses work, 7 fail every time. A real 17-title profile (each title doubling via acronym-alias expansion) was destined to fail regardless of timing. Fixed properly: the combined search expression now caps at a confirmed-safe 6 terms (prioritizing exactTitles, never splitting a term from its own alias), reporting which titles got dropped by the cap rather than silently searching a subset. Re-tested live and it worked: an 11-company run (stopped correctly by the shared touch budget) found 77 real contacts with zero insights-load errors. Reviewing that batch for quality (at the user's own request) surfaced a third real bug: classifyCandidate's plain substring matching let short acronyms match inside unrelated words - "CTO" inside "director"/"sector", "AI" inside "Affairs"/"Airworthiness" - wrongly tagging several real people (an L&amp;D director, a water-sector specialist, an airworthiness engineer) as CTO/CIO/AI matches. Fixed by reusing storage.js's existing containsWholeWord (built for this exact class of bug elsewhere in the codebase) instead of the naive check. Of the two remaining limitations initially accepted, one turned out solvable after all (user's own idea, validated against the real batch before building): a "CTO title held at a different company mentioned in the same headline" case (Robin Waech: "Head Intelligent Robotics &amp; ML @ AXA · CTO @ Material Upcycling AG") is now caught by splitting the headline on its own delimiters (·, ;, /) and checking, per segment, whether the matched term's segment names the target company, a different one, or none - a whole-headline check doesn't work since Robin Waech's headline mentions AXA too, just in a different segment. A real regex bug was caught and fixed before shipping this (\b doesn't anchor correctly right before @ when preceded by whitespace - verified directly with a real interpreter, not just reasoned about, against every name in the batch). "Chief of Staff to the CIO" remains genuinely unsolved, by mutual agreement - it names the target company correctly, so nothing tells it apart from being the CIO. Phase 7 (merging discovered companies/contacts into the real workbook) is now built and live-tested (2026-09-16); Phase 8 (company-level AI prioritization, both imported and Discovered-only companies) is now also built (2026-09-17) but not yet live-tested.</w:t>
+      </w:r>
+    </w:p>
+    <w:p>
+      <w:pPr>
+        <w:pStyle w:val="Heading3"/>
+      </w:pPr>
+      <w:r>
+        <w:t>6.21 Web research, findings and automatic arbitration (v1.1.3)</w:t>
+      </w:r>
+    </w:p>
+    <w:p>
+      <w:r>
+        <w:t>The imported workbook is a snapshot, researched outside the extension. v1.1.3 lets SalesTeam check and complete it itself: each account can be researched on the public web through Anthropic's web search, on the user's own API key, and what the research finds is compared field by field against what the account already holds. Two sides are named throughout, in the UI and in this spec: the current value (imported or edited) and the web finding. Never "yours" - the data is shared across a team.</w:t>
+      </w:r>
+    </w:p>
+    <w:p>
+      <w:r>
+        <w:rPr>
+          <w:b/>
+        </w:rPr>
+        <w:t>Research</w:t>
+      </w:r>
+    </w:p>
+    <w:p>
+      <w:pPr>
+        <w:pStyle w:val="ListBullet"/>
+      </w:pPr>
+      <w:r>
+        <w:t>Research this account on the web - a button on every Account page. Searches the company website, official registers and news, saves a short briefing with its sources, adds initiatives found to the account's Initiatives list, and has a Stop button that keeps what was found. Up to 3 accounts at once. No new permission.</w:t>
+      </w:r>
+    </w:p>
+    <w:p>
+      <w:pPr>
+        <w:pStyle w:val="ListBullet"/>
+      </w:pPr>
+      <w:r>
+        <w:t>Research Accounts on the Web… - the same for many accounts in one background run: pick priorities (P1-P5, not scored), only what is missing or everything, and whether empty fields are filled in automatically. Shows the estimated cost first, runs two accounts at a time, stops at a cost limit, and persists each account as it finishes. Measured: about US$0.08 and 18 s per account; all 454 researched accounts done 2026-09-22.</w:t>
+      </w:r>
+    </w:p>
+    <w:p>
+      <w:pPr>
+        <w:pStyle w:val="ListBullet"/>
+      </w:pPr>
+      <w:r>
+        <w:t>One batch process at a time - a scan, discovery, bulk research, AI prioritization or look-up run each block the others; starting a second one names the running one and offers to stop it or wait.</w:t>
+      </w:r>
+    </w:p>
+    <w:p>
+      <w:pPr>
+        <w:pStyle w:val="ListBullet"/>
+      </w:pPr>
+      <w:r>
+        <w:t>Billing page and cost warning - Settings → Billing shows tokens, web searches and an estimated US$ cost of every AI call on the user's key (today, month, all time, per feature). Any AI action estimated above a set limit (default US$2.00, 0 = off) asks for confirmation first.</w:t>
+      </w:r>
+    </w:p>
+    <w:p>
+      <w:r>
+        <w:rPr>
+          <w:b/>
+        </w:rPr>
+        <w:t>Findings</w:t>
+      </w:r>
+    </w:p>
+    <w:p>
+      <w:pPr>
+        <w:pStyle w:val="ListBullet"/>
+      </w:pPr>
+      <w:r>
+        <w:t>Review findings… - per account, one row per field that differs, each with two mutually exclusive ticks: Use Web Findings and Keep Current. Empty current fields are pre-ticked for the web finding. Keep Current records the turned-down VALUE (accountExtras.webFindingsDismissed), so a later research finding something different comes back. The rows read Global HQ country / Global HQ city, because the stored field means the group's headquarters.</w:t>
+      </w:r>
+    </w:p>
+    <w:p>
+      <w:pPr>
+        <w:pStyle w:val="ListBullet"/>
+      </w:pPr>
+      <w:r>
+        <w:t>Web Findings column - on the Accounts table: "N to review" / "Researched" / empty, sorted by the count, filterable like any column. Card, toast and column all derive from the same openFindings(), so they cannot disagree.</w:t>
+      </w:r>
+    </w:p>
+    <w:p>
+      <w:pPr>
+        <w:pStyle w:val="ListBullet"/>
+      </w:pPr>
+      <w:r>
+        <w:t>Edits and research write to overrides - never onto the imported row. Every reader of company figures must go through the overrides - scoring (getCompaniesForPrioritization) and the missing-size count (getCompaniesNeedingSize) were fixed in 1.1.3 to do so.</w:t>
+      </w:r>
+    </w:p>
+    <w:p>
+      <w:pPr>
+        <w:pStyle w:val="ListBullet"/>
+      </w:pPr>
+      <w:r>
+        <w:t>Global HQ Country editable - added to the account Edit form as a dropdown of countries already in the workbook (a classification, like Local / Global, not a measured figure). Choosing the imported value clears the override.</w:t>
+      </w:r>
+    </w:p>
+    <w:p>
+      <w:r>
+        <w:rPr>
+          <w:b/>
+        </w:rPr>
+        <w:t>Cleaner numbers</w:t>
+      </w:r>
+    </w:p>
+    <w:p>
+      <w:pPr>
+        <w:pStyle w:val="ListBullet"/>
+      </w:pPr>
+      <w:r>
+        <w:t>value-normalize.js - a pure module that reads "6,500+", "&gt;5,000", "102'000", "1,5m" and "CHF 102m" as the numbers they mean before anything compares or scores them. It never guesses at scale: 115 stays 115.</w:t>
+      </w:r>
+    </w:p>
+    <w:p>
+      <w:pPr>
+        <w:pStyle w:val="ListBullet"/>
+      </w:pPr>
+      <w:r>
+        <w:t>Revenue &amp; Currency - Settings → Advanced tools: target currency and an editable, dated exchange-rate table (no live feed, no network call). Revenue is compared after conversion. Global revenue uses Revenue_Currency, local revenue its own Swiss_Revenue_Currency. Normalisation happens on read; stored data is untouched.</w:t>
+      </w:r>
+    </w:p>
+    <w:p>
+      <w:r>
+        <w:rPr>
+          <w:b/>
+        </w:rPr>
+        <w:t>Automatic arbitration</w:t>
+      </w:r>
+    </w:p>
+    <w:p>
+      <w:pPr>
+        <w:pStyle w:val="ListBullet"/>
+      </w:pPr>
+      <w:r>
+        <w:t>Resolve Web Findings Automatically… - Target Accounts Dashboard. A dry run over every researched account, shown as a per-rule table with totals and examples, confirmed before anything is written. One Activity Log line per finding (written in one batch), and one-click undo of the whole run.</w:t>
+      </w:r>
+    </w:p>
+    <w:p>
+      <w:pPr>
+        <w:pStyle w:val="ListBullet"/>
+      </w:pPr>
+      <w:r>
+        <w:t>Why most findings need no person - only two fields affect a score: the global employee count (through its size band) and the global HQ country (through the location priority set in the wizard, +-8). Everything else - revenue, currency, HQ city, local employees, registry fields - is decided automatically.</w:t>
+      </w:r>
+    </w:p>
+    <w:p>
+      <w:pPr>
+        <w:pStyle w:val="ListBullet"/>
+      </w:pPr>
+      <w:r>
+        <w:t>The rules - fill empty fields; throw away web findings that cannot be right and ask only when the current value is the doubtful one; decide non-scoring fields; decide employee counts in the same size band or within a tolerance (default 15%); ask when a count changes the size band; ask when an HQ country changes the location priority; take a real worldwide figure when the stored one is a copy of the local one; take the web finding when the workbook records only weak evidence behind the current value; decide the HQ country from the account's Local / Global classification (Global keeps the non-Swiss country, Local keeps Switzerland; with no classification, Switzerland found against a foreign current country is treated as the Swiss subsidiary's seat); throw away a whole research result when any part of it is impossible.</w:t>
+      </w:r>
+    </w:p>
+    <w:p>
+      <w:pPr>
+        <w:pStyle w:val="ListBullet"/>
+      </w:pPr>
+      <w:r>
+        <w:t>Fail-safe by design - every rule is a setting (Settings → Advanced tools → Web Findings – Automatic Arbitration), shown by name, never by number. Switching a rule off sends its cases to human review, never to a silent write. A value that fails the plausibility checks is never written, whatever the settings. Revenue currency is never put to the user.</w:t>
+      </w:r>
+    </w:p>
+    <w:p>
+      <w:pPr>
+        <w:pStyle w:val="ListBullet"/>
+      </w:pPr>
+      <w:r>
+        <w:t>Result on the real data - 257 of 541 accounts had findings; after the rules, 5 needed a person (2026-09-23).</w:t>
+      </w:r>
+    </w:p>
+    <w:p>
+      <w:pPr>
+        <w:pStyle w:val="ListBullet"/>
+      </w:pPr>
+      <w:r>
+        <w:t>Separate undo slots - bulk edit and automatic resolve each keep their own undo record (EXTRAS_UNDO_SLOTS), so a routine bulk edit cannot destroy the undo of a resolve that touched hundreds of accounts.</w:t>
+      </w:r>
+    </w:p>
+    <w:p>
+      <w:r>
+        <w:rPr>
+          <w:b/>
+        </w:rPr>
+        <w:t>Tables and exchange</w:t>
+      </w:r>
+    </w:p>
+    <w:p>
+      <w:pPr>
+        <w:pStyle w:val="ListBullet"/>
+      </w:pPr>
+      <w:r>
+        <w:t>Bulk edit - tick rows on the Accounts and Contacts tables; the header box ticks the current page only, and a second explicit click reaches every filtered row (Gmail's rule). Status, Priority (accounts only), Next action due, or Remove, with one-click undo. One storage read and write per batch.</w:t>
+      </w:r>
+    </w:p>
+    <w:p>
+      <w:pPr>
+        <w:pStyle w:val="ListBullet"/>
+      </w:pPr>
+      <w:r>
+        <w:t>HubSpot import and export by file - Export to HubSpot… writes a companies file and a contacts file that HubSpot maps automatically, with SalesTeam priority and status as extra columns. Import from HubSpot… adds companies and contacts SalesTeam does not have yet, without changing existing ones.</w:t>
       </w:r>
     </w:p>
     <w:p>

</xml_diff>

<commit_message>
PRD: fifth wizard-list lead filter, Other Excluded Companies (1.2.0.25)
Co-Authored-By: Claude Opus 5.5 <noreply@anthropic.com>
</commit_message>
<xml_diff>
--- a/PRD.docx
+++ b/PRD.docx
@@ -506,6 +506,14 @@
       </w:pPr>
       <w:r>
         <w:t>Competitor Blocklist and Known Recruiting Firms (renamed “Recruiting Companies”) became wizard-list-backed (2026-09-16), plus 2 new such filters, Existing Customers and Existing Partners - reported directly: the Setup wizard already has its own dedicated company-exclusion lists for exactly this purpose (competitorCompanySlugs/recruiterCompanySlugs/existingCustomerCompanySlugs/existingPartnerCompanySlugs, 6.20), so maintaining a second, independently-edited keyword list here was pure duplication - “it is better to use the lists from the Wizard.” These 4 topics now carry a sourceList field that computes their keywords fresh from the matching wizard list on every getNegativeTopics() call, always matchField: company - a wizard slug (e.g. “randstad-switzerland”) is converted to a space-separated pseudo-name (“randstad switzerland”) before the same fuzzy suffix-stripped comparison runs, so a slug with no hyphens (“lhhworldwide”) won't fuzzy-match a differently-formatted display name (“LHH”) - an accepted best-effort limitation, not solved further. background.js's scan-time tagging, Apply Negative Filters, and the merge functions all pick this up automatically, no changes needed there. The side panel no longer lets these 4 be renamed, rescoped by match field, or have keywords edited directly - each is just an enabled checkbox (e.g. “Filter out competitors, listed in the main settings”) plus the existing Posts+Jobs/Post-only/Job-only scope dropdown and a live company-count hint. A stored negativeTopics array from before this change is backfilled on next read, never reset. Recruiter/Staffing Headline Filter and AI/Cloud Vendor Blocklist are unaffected - genuinely different mechanisms, not backed by any wizard list.</w:t>
+      </w:r>
+    </w:p>
+    <w:p>
+      <w:pPr>
+        <w:pStyle w:val="ListBullet"/>
+      </w:pPr>
+      <w:r>
+        <w:t>A fifth such filter, Other Excluded Companies (1.2.0.25, 2026-10-01) - companies excluded under the wizard's Other category had no lead filter, so a keyword-scan post from one of them still came through as a lead. Now every excluded company is filtered, whatever its category: builtin-other-exclusions (sourceList others -&gt; category other), on by default and added to existing installs by the same backfill. The wizard's Exclusions step says so: an excluded company never shows up in Target Accounts and is never scanned for leads.</w:t>
       </w:r>
     </w:p>
     <w:p>

</xml_diff>

<commit_message>
Release notes for 1.2.1 (builds 1.2.0.1-1.2.0.39); PRD 6.22 Onboarding research, mirrored in gen_docs.py; both docx regenerated
Co-Authored-By: Claude Opus 5.5 <noreply@anthropic.com>
</commit_message>
<xml_diff>
--- a/PRD.docx
+++ b/PRD.docx
@@ -2093,6 +2093,123 @@
       </w:pPr>
       <w:r>
         <w:t>HubSpot import and export by file - Export to HubSpot… writes a companies file and a contacts file that HubSpot maps automatically, with SalesTeam priority and status as extra columns. Import from HubSpot… adds companies and contacts SalesTeam does not have yet, without changing existing ones.</w:t>
+      </w:r>
+    </w:p>
+    <w:p>
+      <w:pPr>
+        <w:pStyle w:val="Heading3"/>
+      </w:pPr>
+      <w:r>
+        <w:t>6.22 Onboarding research (v1.2.1)</w:t>
+      </w:r>
+    </w:p>
+    <w:p>
+      <w:r>
+        <w:t>1.2.1 lets the Setup propose its own answers and build the list it describes, researching on the web first and using LinkedIn only for what the web could not confirm. The full design, its decisions (D1-D11) and the measurements are in ONBOARDING_RESEARCH_DESIGN.md; the requirements in ONBOARDING_RESEARCH_REQUIREMENTS.md.</w:t>
+      </w:r>
+    </w:p>
+    <w:p>
+      <w:r>
+        <w:rPr>
+          <w:b/>
+        </w:rPr>
+        <w:t>Setup</w:t>
+      </w:r>
+    </w:p>
+    <w:p>
+      <w:pPr>
+        <w:pStyle w:val="ListBullet"/>
+      </w:pPr>
+      <w:r>
+        <w:t>About you - a new first step: company, website, language. Research my company (about US$0.30, one to two minutes, a progress screen with Stop and Skip) reads the seller's website and proposes Location, Size, Industry, What you sell, Things you can offer, Ideal customer, Target contacts and Companies to exclude (setup-proposals.js, pure; proposal-ui.js). On a first setup the proposals are filled in; on an existing setup each is shown beside the current value and taken only with Use proposal.</w:t>
+      </w:r>
+    </w:p>
+    <w:p>
+      <w:pPr>
+        <w:pStyle w:val="ListBullet"/>
+      </w:pPr>
+      <w:r>
+        <w:t>Offered once to existing installs - a setup finished without the research sees a one-time offer on the Settings cards and at the top of Change Settings - Research (opens About you with the research started) or No thanks (setupResearch.declinedInSettings). The action stays under Settings &gt; User Profile &gt; Open About you.</w:t>
+      </w:r>
+    </w:p>
+    <w:p>
+      <w:pPr>
+        <w:pStyle w:val="ListBullet"/>
+      </w:pPr>
+      <w:r>
+        <w:t>New steps - Initiative stages (ranked, at least one ticked), Companies to include (Name, website - the exclusion list wins), How big is your list (accounts, contacts per account, initiatives per account) with a live cost-and-time estimate from onboarding-estimate.js, measured averages replacing the defaults after 20 accounts. 15 steps in all.</w:t>
+      </w:r>
+    </w:p>
+    <w:p>
+      <w:pPr>
+        <w:pStyle w:val="ListBullet"/>
+      </w:pPr>
+      <w:r>
+        <w:t>Finish - with automatic preparation and web research ticked, Finish starts the build: included companies, then Web Discovery from company listings on the web (Source “Web”), then the web lane; LinkedIn is kicked. The wizard itself never visits LinkedIn. The stop rule ends discovery at the list's target.</w:t>
+      </w:r>
+    </w:p>
+    <w:p>
+      <w:r>
+        <w:rPr>
+          <w:b/>
+        </w:rPr>
+        <w:t>Building the accounts</w:t>
+      </w:r>
+    </w:p>
+    <w:p>
+      <w:pPr>
+        <w:pStyle w:val="ListBullet"/>
+      </w:pPr>
+      <w:r>
+        <w:t>Web lane - per account, one research asking only for what is missing (size, HQ, initiatives at the ticked stages, up to five contacts at the Setup seniority levels, LinkedIn profiles from search results); per-field sources; contacts-only research on Haiku 4.5; carries on by itself while LinkedIn waits for its daily limit, within the monthly budget.</w:t>
+      </w:r>
+    </w:p>
+    <w:p>
+      <w:pPr>
+        <w:pStyle w:val="ListBullet"/>
+      </w:pPr>
+      <w:r>
+        <w:t>Usable without LinkedIn - an account with web-verified contacts counts as Usable (readiness.js); LinkedIn after the web: one name search, then the People page, stopping at the target contacts per account. The first 10 Ready are built first; the Scanner starts at 10 Ready.</w:t>
+      </w:r>
+    </w:p>
+    <w:p>
+      <w:pPr>
+        <w:pStyle w:val="ListBullet"/>
+      </w:pPr>
+      <w:r>
+        <w:t>Safety - account write lock across parallel jobs; 429 back-off and resume; a LinkedIn login wall stops the pipeline and asks the user to log in instead of marking accounts not found.</w:t>
+      </w:r>
+    </w:p>
+    <w:p>
+      <w:r>
+        <w:rPr>
+          <w:b/>
+        </w:rPr>
+        <w:t>Tables and exports</w:t>
+      </w:r>
+    </w:p>
+    <w:p>
+      <w:pPr>
+        <w:pStyle w:val="ListBullet"/>
+      </w:pPr>
+      <w:r>
+        <w:t>Accounts and contacts CSV - Export Accounts (CSV) and Export Contacts (CSV): one file per table, every column under SalesTeam's own names, dates as dates, Seniority Priority as High/Medium/Low. With a search or column filter on, the user chooses all rows or only the filtered ones. All exports (accounts, contacts, posts) leave out columns empty in every row and put columns filled in fewer than half the rows last (compactCsvColumns, csv-export.js).</w:t>
+      </w:r>
+    </w:p>
+    <w:p>
+      <w:pPr>
+        <w:pStyle w:val="ListBullet"/>
+      </w:pPr>
+      <w:r>
+        <w:t>Visible filters - on Posts, Target Accounts and Target Contacts every active filter is a chip above the table with its own remove button and Clear all; a filtered column has a tinted header; an empty table names the filters hiding its rows. On Posts the Status dropdown and the Status column filter are one filter: an exact status in the column becomes the dropdown's value, any other Status column filter shows in the dropdown as its own entry.</w:t>
+      </w:r>
+    </w:p>
+    <w:p>
+      <w:pPr>
+        <w:pStyle w:val="ListBullet"/>
+      </w:pPr>
+      <w:r>
+        <w:t>One top status bar - running and waiting jobs show in one bar at the top of every page; pop-ups only for decisions and finished jobs.</w:t>
       </w:r>
     </w:p>
     <w:p>

</xml_diff>

<commit_message>
1.2.0.45: Posts Dashboard renamed Leads Dashboard; running text says 'leads (posts)' (menus and buttons keep 'Leads'); Leads Prioritization intro rewritten; Help, store listing, PRD and release notes follow
Co-Authored-By: Claude Opus 5.5 <noreply@anthropic.com>
</commit_message>
<xml_diff>
--- a/PRD.docx
+++ b/PRD.docx
@@ -1834,23 +1834,23 @@
         <w:pStyle w:val="ListBullet"/>
       </w:pPr>
       <w:r>
-        <w:t>Overview card fields click-to-expand (v0.29.60) - reported directly with a screenshot: a truncated field (e.g. “Team Head Digital Workpl...”) in the Account/Contact overview card should use the same click-to-expand/collapse behavior already used on the Posts Dashboard's own truncated cells (dashboard.js's contentCell/.content-cell) - click to see the full value, click again to collapse. buildField (target-accounts.js) takes an expandable flag - every plain-text field in the compact grid gets an .overview-value-expandable class and a click listener toggling .expanded, same pattern as .content-cell. Long fields (e.g. “Top AI initiatives”, already shown full-width with normal wrapping) deliberately don't get this - truncating them to one line first would fight the point of breaking them out to their own row. Wired the same way the Dashboard does it: always active, not just when a value happens to be actually truncated.</w:t>
-      </w:r>
-    </w:p>
-    <w:p>
-      <w:pPr>
-        <w:pStyle w:val="ListBullet"/>
-      </w:pPr>
-      <w:r>
-        <w:t>Three parallel dashboards, pie-chart stats, and a Target Contacts Dashboard (v0.29.61) - reported directly, three linked requests. Naming: “Target Accounts Dashboard” / “Target Contacts Dashboard” / “Posts Dashboard” - fully descriptive, parallel names rather than an ambiguous “The Dashboard,” so the tab title and page heading always say which of the three is showing; file names unchanged, only display text. New renderGenericPieChart(containerEl, slices, {unitLabel, onSliceClick}) - the Posts Dashboard's own renderPieChart (dashboard.js) is hardwired to lead-status buckets; rather than generalize it (real regression risk to an already-shipped chart), this is a fresh, genuinely generic version in target-accounts.js, same SVG technique, taking pre-bucketed {label, count, color} slices - one implementation reused by every pie on both new dashboards. Target Accounts Dashboard gets four pies: AI Priority range (bucketing the real aiPriorityScore field into 90-100/80-90/70-80/60-70/below-60/no-score - 17 of 500 companies have no score, given its own slice rather than folded into “below 60”), Evidence level (real workbook values, not guessed: Rich Evidence/Sufficient Evidence/Insufficient - Missing baseline), Account status (Not contacted/Contacted/Responded - no stored “account status” field exists or should exist; derived from the account's own associated leads' real status, same reasoning as lastCommunicationFor), and a proposed 4th, Contact coverage (0/1-2/3+ known Target Contacts per account, via workbook.contacts grouped by companyId) - the most actionable addition given contacts research is still mid-rollout (83 of 500 accounts covered when this shipped), a gap none of the other three pies surface. Target Contacts Dashboard (new #contacts hash route in the same page, a tab bar switches between the two list views, hidden on Account/Contact detail views): a full second sortable/filterable/paginated table across every Target Contact. Deliberately its own parallel state/column-config/render functions (CONTACT_LIST_COLUMNS, contactSortField, renderContactsTable, buildContactsPaginationBar, etc.), not a generalized shared table widget - the Companies table's sort/filter/hide-columns/pagination machinery is large and already working; refactoring it into something reusable risks regressing a table the user depends on daily for a codebase-hygiene win alone. The purely generic cell-formatting helpers it already had (renderCellContent, rawValue, sortValue, filterText, formatValue, formatExcelDate, formatNumber - none of them actually reference COMPANY_COLUMNS, just whatever column object they're given) ARE reused directly, since duplicating those would be pure risk with no reuse-vs-risk tradeoff to weigh. Same flag column meaning as the Accounts list (hasOverdueAction on the contact's own targetContactExtras due-date, or an unreviewed post via findLeadsForContact); row click opens the existing Contact view (contactKeyFor/openContact). Two pies: Contact status (same derivation as Account status, scoped via findLeadsForContact) and a proposed 2nd, LinkedIn verification (Current - LinkedIn verified/Legacy - LinkedIn reverify/Not verified, bucketing evidenceQuality2 - the exact field the duplicate-header fix, v0.29.51, made trustworthy in the first place). Posts Dashboard: creatorCell now calls findTargetContactMatch (storage.js, exported - already built for the priority-signal feature, 6.11) and appends a “Target Contact” badge/link when a post's author is a known Target Contact; clicking it opens target-accounts.html#contact=&lt;key&gt;, the same cross-page pattern openLeadInDashboard already uses in the opposite direction. Target Contacts are loaded once at page init and refreshed only via a dedicated targetAccountsWorkbook storage-change listener branch, not re-fetched on every one of the Posts Dashboard's frequent loadLeads() calls. Not yet confirmed live at ship time.</w:t>
-      </w:r>
-    </w:p>
-    <w:p>
-      <w:pPr>
-        <w:pStyle w:val="ListBullet"/>
-      </w:pPr>
-      <w:r>
-        <w:t>Side panel navigation fixed (v0.29.62) - reported directly: the new Target Contacts Dashboard had no side panel button at all, only reachable as an in-page tab from the Accounts Dashboard. A new “Target Contacts Dashboard” button opens target-accounts.html#contacts directly (the same in-page hash route the tab bar itself uses). Side panel button order changed to Target Accounts Dashboard, Target Contacts Dashboard, Posts Dashboard, Advisors, Settings, Activity Log, Help - Help kept last per explicit instruction, to stay last as more buttons get added over time.</w:t>
+        <w:t>Overview card fields click-to-expand (v0.29.60) - reported directly with a screenshot: a truncated field (e.g. “Team Head Digital Workpl...”) in the Account/Contact overview card should use the same click-to-expand/collapse behavior already used on the Leads Dashboard's own truncated cells (dashboard.js's contentCell/.content-cell) - click to see the full value, click again to collapse. buildField (target-accounts.js) takes an expandable flag - every plain-text field in the compact grid gets an .overview-value-expandable class and a click listener toggling .expanded, same pattern as .content-cell. Long fields (e.g. “Top AI initiatives”, already shown full-width with normal wrapping) deliberately don't get this - truncating them to one line first would fight the point of breaking them out to their own row. Wired the same way the Dashboard does it: always active, not just when a value happens to be actually truncated.</w:t>
+      </w:r>
+    </w:p>
+    <w:p>
+      <w:pPr>
+        <w:pStyle w:val="ListBullet"/>
+      </w:pPr>
+      <w:r>
+        <w:t>Three parallel dashboards, pie-chart stats, and a Target Contacts Dashboard (v0.29.61) - reported directly, three linked requests. Naming: “Target Accounts Dashboard” / “Target Contacts Dashboard” / “Leads Dashboard” - fully descriptive, parallel names rather than an ambiguous “The Dashboard,” so the tab title and page heading always say which of the three is showing; file names unchanged, only display text. New renderGenericPieChart(containerEl, slices, {unitLabel, onSliceClick}) - the Posts Dashboard's own renderPieChart (dashboard.js) is hardwired to lead-status buckets; rather than generalize it (real regression risk to an already-shipped chart), this is a fresh, genuinely generic version in target-accounts.js, same SVG technique, taking pre-bucketed {label, count, color} slices - one implementation reused by every pie on both new dashboards. Target Accounts Dashboard gets four pies: AI Priority range (bucketing the real aiPriorityScore field into 90-100/80-90/70-80/60-70/below-60/no-score - 17 of 500 companies have no score, given its own slice rather than folded into “below 60”), Evidence level (real workbook values, not guessed: Rich Evidence/Sufficient Evidence/Insufficient - Missing baseline), Account status (Not contacted/Contacted/Responded - no stored “account status” field exists or should exist; derived from the account's own associated leads' real status, same reasoning as lastCommunicationFor), and a proposed 4th, Contact coverage (0/1-2/3+ known Target Contacts per account, via workbook.contacts grouped by companyId) - the most actionable addition given contacts research is still mid-rollout (83 of 500 accounts covered when this shipped), a gap none of the other three pies surface. Target Contacts Dashboard (new #contacts hash route in the same page, a tab bar switches between the two list views, hidden on Account/Contact detail views): a full second sortable/filterable/paginated table across every Target Contact. Deliberately its own parallel state/column-config/render functions (CONTACT_LIST_COLUMNS, contactSortField, renderContactsTable, buildContactsPaginationBar, etc.), not a generalized shared table widget - the Companies table's sort/filter/hide-columns/pagination machinery is large and already working; refactoring it into something reusable risks regressing a table the user depends on daily for a codebase-hygiene win alone. The purely generic cell-formatting helpers it already had (renderCellContent, rawValue, sortValue, filterText, formatValue, formatExcelDate, formatNumber - none of them actually reference COMPANY_COLUMNS, just whatever column object they're given) ARE reused directly, since duplicating those would be pure risk with no reuse-vs-risk tradeoff to weigh. Same flag column meaning as the Accounts list (hasOverdueAction on the contact's own targetContactExtras due-date, or an unreviewed post via findLeadsForContact); row click opens the existing Contact view (contactKeyFor/openContact). Two pies: Contact status (same derivation as Account status, scoped via findLeadsForContact) and a proposed 2nd, LinkedIn verification (Current - LinkedIn verified/Legacy - LinkedIn reverify/Not verified, bucketing evidenceQuality2 - the exact field the duplicate-header fix, v0.29.51, made trustworthy in the first place). Leads Dashboard: creatorCell now calls findTargetContactMatch (storage.js, exported - already built for the priority-signal feature, 6.11) and appends a “Target Contact” badge/link when a post's author is a known Target Contact; clicking it opens target-accounts.html#contact=&lt;key&gt;, the same cross-page pattern openLeadInDashboard already uses in the opposite direction. Target Contacts are loaded once at page init and refreshed only via a dedicated targetAccountsWorkbook storage-change listener branch, not re-fetched on every one of the Leads Dashboard's frequent loadLeads() calls. Not yet confirmed live at ship time.</w:t>
+      </w:r>
+    </w:p>
+    <w:p>
+      <w:pPr>
+        <w:pStyle w:val="ListBullet"/>
+      </w:pPr>
+      <w:r>
+        <w:t>Side panel navigation fixed (v0.29.62) - reported directly: the new Target Contacts Dashboard had no side panel button at all, only reachable as an in-page tab from the Accounts Dashboard. A new “Target Contacts Dashboard” button opens target-accounts.html#contacts directly (the same in-page hash route the tab bar itself uses). Side panel button order changed to Target Accounts Dashboard, Target Contacts Dashboard, Leads Dashboard, Advisors, Settings, Activity Log, Help - Help kept last per explicit instruction, to stay last as more buttons get added over time.</w:t>
       </w:r>
     </w:p>
     <w:p>
@@ -2497,7 +2497,7 @@
         <w:pStyle w:val="ListBullet"/>
       </w:pPr>
       <w:r>
-        <w:t>UI/navigation redesign - scoped and approved 2026-09-17, not yet built. Started from a narrow complaint (the “Remove Account” link too prominent) and widened into a full cross-cutting design pass once the user noticed how much action-button surface has piled up this session (Resolve IDs, Discover Contacts, Fetch Company Size, Prioritize Companies all landed in the same shared page header in one session - confirmed as a real bug too: that header sits outside the Target Accounts/Contacts tab switcher, so company-only actions show on the Contacts tab). Approved via a 4-artboard visual mockup (link in the plan file). Scope: (1) row-level kebab menus replacing Posts Dashboard's 6 always-visible icons and adding per-row actions to Target Accounts (Open/Edit/Merge/Remove) and Target Contacts (Open/Edit/Remove, no Merge - contacts already dedupe automatically); (2) a left-nav shell for the 3 full-tab pages (not the side panel, a genuinely different constrained surface), grouping today's flat button rows by topic with modals for anything needing input; (3) Edit + Merge for Target Accounts, built on a new import-surviving override layer (targetAccountExtras, merged in only at display/scoring read sites, deliberately never baked into the shared getTargetAccountsWorkbook() reader, since several existing functions read-tweak-write the whole workbook back and would otherwise silently bake an edit into permanent storage) - full editability of every imported field, confirmed by the user over a narrower option; (4) soft-delete UX fixes (reposition/reword the link, add a Restore view) - the delete mechanics were already non-destructive and audit-logged, only the presentation was the problem; (5) a side panel rethink - the Scanner moves to its own full tab, the panel becomes a Quick Launch list plus a new pipeline stats summary; (6) “Send Message” made LinkedIn-safe by explicit design choice - the user's own original idea (auto-paste into LinkedIn's compose box) was flagged as crossing this project's deliberate “never automate an action on LinkedIn's own UI” boundary, resolved instead as clipboard-copy + navigate to the contact's profile, human still clicks Message/paste/Send themselves.</w:t>
+        <w:t>UI/navigation redesign - scoped and approved 2026-09-17, not yet built. Started from a narrow complaint (the “Remove Account” link too prominent) and widened into a full cross-cutting design pass once the user noticed how much action-button surface has piled up this session (Resolve IDs, Discover Contacts, Fetch Company Size, Prioritize Companies all landed in the same shared page header in one session - confirmed as a real bug too: that header sits outside the Target Accounts/Contacts tab switcher, so company-only actions show on the Contacts tab). Approved via a 4-artboard visual mockup (link in the plan file). Scope: (1) row-level kebab menus replacing Leads Dashboard's 6 always-visible icons and adding per-row actions to Target Accounts (Open/Edit/Merge/Remove) and Target Contacts (Open/Edit/Remove, no Merge - contacts already dedupe automatically); (2) a left-nav shell for the 3 full-tab pages (not the side panel, a genuinely different constrained surface), grouping today's flat button rows by topic with modals for anything needing input; (3) Edit + Merge for Target Accounts, built on a new import-surviving override layer (targetAccountExtras, merged in only at display/scoring read sites, deliberately never baked into the shared getTargetAccountsWorkbook() reader, since several existing functions read-tweak-write the whole workbook back and would otherwise silently bake an edit into permanent storage) - full editability of every imported field, confirmed by the user over a narrower option; (4) soft-delete UX fixes (reposition/reword the link, add a Restore view) - the delete mechanics were already non-destructive and audit-logged, only the presentation was the problem; (5) a side panel rethink - the Scanner moves to its own full tab, the panel becomes a Quick Launch list plus a new pipeline stats summary; (6) “Send Message” made LinkedIn-safe by explicit design choice - the user's own original idea (auto-paste into LinkedIn's compose box) was flagged as crossing this project's deliberate “never automate an action on LinkedIn's own UI” boundary, resolved instead as clipboard-copy + navigate to the contact's profile, human still clicks Message/paste/Send themselves.</w:t>
       </w:r>
     </w:p>
     <w:p>
@@ -2521,7 +2521,7 @@
         <w:pStyle w:val="ListBullet"/>
       </w:pPr>
       <w:r>
-        <w:t>UI redesign Step 2 completed + Step 4 built - 2026-09-18, not yet live-tested. One real usability bug found from live feedback and fixed the same day: the kebab column sat at the far right of a wide, horizontally-scrolling table - once scrolled right to see it, it was no longer obvious which row it belonged to. Fixed via position: sticky on both the header and body cells, applied to both Target Accounts/Contacts and (proactively, same underlying problem) the Posts Dashboard table. dashboard.html/.css and settings.html/.css given the same left-nav shell confirmed on Target Accounts first - Dashboard's 8 header buttons became plain nav items (no dialogs needed, none of them ever had a parameter input); Settings (a page of topic cards, not action buttons) got anchor-jump nav items instead. Step 4 (side panel split): scanner.js is an exact, unmodified copy of the old sidepanel.js (1813 lines) powering a new scanner.html tab - the actual scan logic was deliberately never rewritten, only relocated, verified by cross-referencing every element id the script expects against the new page (zero missing). sidepanel.html/.js/.css are a genuine from-scratch rewrite - Quick Launch plus a new pipeline-stats summary (Target Accounts/Contacts counts, leads by status, using the same soft-delete/exclusion filtering as the Dashboard's own so the numbers actually match). “Discover Accounts/Contacts” quick-launch items from the original mockup were deliberately dropped after checking: Company/Contact Discovery (Phase 5/6) triggering only exists today in Settings' own debug test panels, and linking a friendly button to a debug harness would have been misleading - a real gap worth a proper trigger someday.</w:t>
+        <w:t>UI redesign Step 2 completed + Step 4 built - 2026-09-18, not yet live-tested. One real usability bug found from live feedback and fixed the same day: the kebab column sat at the far right of a wide, horizontally-scrolling table - once scrolled right to see it, it was no longer obvious which row it belonged to. Fixed via position: sticky on both the header and body cells, applied to both Target Accounts/Contacts and (proactively, same underlying problem) the Leads Dashboard table. dashboard.html/.css and settings.html/.css given the same left-nav shell confirmed on Target Accounts first - Dashboard's 8 header buttons became plain nav items (no dialogs needed, none of them ever had a parameter input); Settings (a page of topic cards, not action buttons) got anchor-jump nav items instead. Step 4 (side panel split): scanner.js is an exact, unmodified copy of the old sidepanel.js (1813 lines) powering a new scanner.html tab - the actual scan logic was deliberately never rewritten, only relocated, verified by cross-referencing every element id the script expects against the new page (zero missing). sidepanel.html/.js/.css are a genuine from-scratch rewrite - Quick Launch plus a new pipeline-stats summary (Target Accounts/Contacts counts, leads by status, using the same soft-delete/exclusion filtering as the Dashboard's own so the numbers actually match). “Discover Accounts/Contacts” quick-launch items from the original mockup were deliberately dropped after checking: Company/Contact Discovery (Phase 5/6) triggering only exists today in Settings' own debug test panels, and linking a friendly button to a debug harness would have been misleading - a real gap worth a proper trigger someday.</w:t>
       </w:r>
     </w:p>
     <w:p>
@@ -2569,7 +2569,7 @@
         <w:pStyle w:val="ListBullet"/>
       </w:pPr>
       <w:r>
-        <w:t>Posts Dashboard cross-linked from Target Accounts' left nav, plus 3 new stat pies, 2026-09-18: a Posts Dashboard link added to Target Accounts' “Views” nav group (its first-ever cross-page link). Posts Dashboard's stats row gained Priority (P1-P5 + Not scored), Status (all-time), and Source (Post/In-Post Job Ad/Job Listing) pies alongside the original 3 time-windowed ones - 6 cards total, changed from an even-flex row to a horizontally-scrolling strip of fixed-width cards so 6 pies stay readable instead of squeezing down to fit.</w:t>
+        <w:t>Leads Dashboard cross-linked from Target Accounts' left nav, plus 3 new stat pies, 2026-09-18: a Posts Dashboard link added to Target Accounts' “Views” nav group (its first-ever cross-page link). Posts Dashboard's stats row gained Priority (P1-P5 + Not scored), Status (all-time), and Source (Post/In-Post Job Ad/Job Listing) pies alongside the original 3 time-windowed ones - 6 cards total, changed from an even-flex row to a horizontally-scrolling strip of fixed-width cards so 6 pies stay readable instead of squeezing down to fit.</w:t>
       </w:r>
     </w:p>
     <w:p>
@@ -2601,7 +2601,7 @@
         <w:pStyle w:val="ListBullet"/>
       </w:pPr>
       <w:r>
-        <w:t>Cross-page navigation gap closed, same day: every full-tab page's nav only ever showed that page's own actions, with no way back to Settings/Help/Advisors/Activity Log/User Profile except through the side panel. sidepanel.html (already a Quick Launch hub from the Step 4 split) got extended rather than building a second hub page: a new “My Profile ↗” item, and a deliberately separate, visually muted “Debug” item at the very bottom (“not something a normal user will use... only in case of a support session,” the user's own words). Every full-tab page (Target Accounts, Posts Dashboard, Settings, Scanner) gained a “← Home” link as the first nav item - a plain relative link (not chrome.tabs.create like every other cross-page link here) so it navigates the current tab back to the hub instead of opening yet another one. “Target Accounts” was removed from Settings entirely (the user's own question: “Why is the Target account in this Setting menu at all?”) - it only held one redundant “Open Target Accounts Dashboard…” button. Settings' own Debug test panels group was visually de-emphasized and pushed to the bottom of its nav rather than removed outright, so someone arriving via the hub's Debug link can still switch between the 3 panels. Message/Response Language's explanation was rewritten to actually answer “how will this be used” - it's the default language for every AI-generated text in the extension, with one named exception (Customer Voice mirrors a specific real lead's own post language when grounded in one) - and left in Settings rather than moved into Onboarding, since it's a standing app-wide preference (like the API key) rather than part of the one-time targeting profile the wizard's own steps describe.</w:t>
+        <w:t>Cross-page navigation gap closed, same day: every full-tab page's nav only ever showed that page's own actions, with no way back to Settings/Help/Advisors/Activity Log/User Profile except through the side panel. sidepanel.html (already a Quick Launch hub from the Step 4 split) got extended rather than building a second hub page: a new “My Profile ↗” item, and a deliberately separate, visually muted “Debug” item at the very bottom (“not something a normal user will use... only in case of a support session,” the user's own words). Every full-tab page (Target Accounts, Leads Dashboard, Settings, Scanner) gained a “← Home” link as the first nav item - a plain relative link (not chrome.tabs.create like every other cross-page link here) so it navigates the current tab back to the hub instead of opening yet another one. “Target Accounts” was removed from Settings entirely (the user's own question: “Why is the Target account in this Setting menu at all?”) - it only held one redundant “Open Target Accounts Dashboard…” button. Settings' own Debug test panels group was visually de-emphasized and pushed to the bottom of its nav rather than removed outright, so someone arriving via the hub's Debug link can still switch between the 3 panels. Message/Response Language's explanation was rewritten to actually answer “how will this be used” - it's the default language for every AI-generated text in the extension, with one named exception (Customer Voice mirrors a specific real lead's own post language when grounded in one) - and left in Settings rather than moved into Onboarding, since it's a standing app-wide preference (like the API key) rather than part of the one-time targeting profile the wizard's own steps describe.</w:t>
       </w:r>
     </w:p>
     <w:p>
@@ -2633,7 +2633,7 @@
         <w:pStyle w:val="ListBullet"/>
       </w:pPr>
       <w:r>
-        <w:t>Mega-menu, 6th round of direct feedback, 2026-09-19: “Pipeline Overview” removed entirely (redundant once every real destination had its own nav entry). Nothing in the nav opens a new browser tab any more - every cross-page item, including the “big” pages (Target Accounts/Posts Dashboard/Scanner/Settings), now embeds via iframe. Since those 4 pages each have their own full nav shell, a new ?embedded=1 query param makes a page hide its own nav when loaded inside another page's embed, avoiding a nested double sidebar - the embedded page shows only its real content, relying on the host's nav + “← Back” for further navigation. Also fixed: bold was being used for two different things (group headers and the current selected item, reported with a counter-example screenshot from Apollo) - the current item is now marked by its background highlight alone, bold is group-headers-only.</w:t>
+        <w:t>Mega-menu, 6th round of direct feedback, 2026-09-19: “Pipeline Overview” removed entirely (redundant once every real destination had its own nav entry). Nothing in the nav opens a new browser tab any more - every cross-page item, including the “big” pages (Target Accounts/Leads Dashboard/Scanner/Settings), now embeds via iframe. Since those 4 pages each have their own full nav shell, a new ?embedded=1 query param makes a page hide its own nav when loaded inside another page's embed, avoiding a nested double sidebar - the embedded page shows only its real content, relying on the host's nav + “← Back” for further navigation. Also fixed: bold was being used for two different things (group headers and the current selected item, reported with a counter-example screenshot from Apollo) - the current item is now marked by its background highlight alone, bold is group-headers-only.</w:t>
       </w:r>
     </w:p>
     <w:p>
@@ -2665,7 +2665,7 @@
         <w:pStyle w:val="ListBullet"/>
       </w:pPr>
       <w:r>
-        <w:t>Side panel, 10th round of direct feedback, 2026-09-19: “Scan for Leads” fixed to match the other 3 - reported directly, it was “always highlighted in Blue background” (a leftover static .primary CTA style, unrelated to actual selection) and missing the ↗ the other 3 had. .primary removed, ↗ added, and (at the time) a .nav-item.active class was introduced to follow whichever button was last clicked - later removed entirely once it proved unreliable; see the final entry below. Separately, a reported “old version of the left main menu” on Posts Dashboard was investigated and traced to a genuinely older dashboard.html packaged inside builds/v0.31.0/SalesTeam-v0.31.0.zip in this repo (no left nav at all, pre-dating the mega-menu) - not a code bug in the live code/ source, which has the current nav; flagged back to the user to confirm which folder their loaded extension actually points to.</w:t>
+        <w:t>Side panel, 10th round of direct feedback, 2026-09-19: “Scan for Leads” fixed to match the other 3 - reported directly, it was “always highlighted in Blue background” (a leftover static .primary CTA style, unrelated to actual selection) and missing the ↗ the other 3 had. .primary removed, ↗ added, and (at the time) a .nav-item.active class was introduced to follow whichever button was last clicked - later removed entirely once it proved unreliable; see the final entry below. Separately, a reported “old version of the left main menu” on Leads Dashboard was investigated and traced to a genuinely older dashboard.html packaged inside builds/v0.31.0/SalesTeam-v0.31.0.zip in this repo (no left nav at all, pre-dating the mega-menu) - not a code bug in the live code/ source, which has the current nav; flagged back to the user to confirm which folder their loaded extension actually points to.</w:t>
       </w:r>
     </w:p>
     <w:p>
@@ -2681,47 +2681,47 @@
         <w:pStyle w:val="ListBullet"/>
       </w:pPr>
       <w:r>
-        <w:t>Posts Dashboard sub-labels flattened, 11th round of direct feedback, 2026-09-19: the actual root cause of the “old version of the left main menu” report - dashboard.html's own nav group still divided its 8 action items into Scoring/Enrichment/Export sub-labels, a deliberate choice made in the 5th round specifically because Target Accounts/Target Contacts got simplified past that style while Posts Dashboard (and Settings) kept it for having more items. Reported directly: “the menu has these older version of sections... that we no longer have in the menu of Target Accounts and Target Contacts.” Fixed by flattening Posts Dashboard's own group to match (sub-label divs removed, same 8 items now flat; .nav-group-sublabel deleted from dashboard.css as now-dead code). settings.html has the same kind of sub-division and was left unchanged - flagged to the user as an open question rather than assumed into scope.</w:t>
-      </w:r>
-    </w:p>
-    <w:p>
-      <w:pPr>
-        <w:pStyle w:val="ListBullet"/>
-      </w:pPr>
-      <w:r>
-        <w:t>Kebab/Actions column sticky-header bug fixed, 12th round of direct feedback, 2026-09-19: reported with a screenshot - the Posts Dashboard table's row kebab (⋮) menu appeared positioned over the last visible column instead of to the side. Reproduced live with a synthetic copy of the table (real data needs chrome.storage, unavailable outside a loaded extension) and confirmed via getComputedStyle: the body td.actions-cell was correctly position: sticky the whole time, but the HEADER th.actions-cell computed to position: relative instead - #results-table th { position: relative; ...} (ID + element, specificity 1-0-1) was beating the sticky rule (class + element, 0-1-1), an ID always outranking any number of classes regardless of source order. With no “Actions” label pinned above the (correctly pinned) kebab buttons, they read as attached to whichever column was last visible. Same bug found and fixed proactively in target-accounts.css's .actions-col (shared by the Companies/Contacts tables, identical root cause) even though not reported there yet. Fixed by scoping both rules with their table's own id so specificity actually wins - no JS/HTML changes needed. Still open per the user's immediate follow-up: the header-label fix didn't resolve it - the kebab still visually overlays the last visible data column while scrolled, which may be the sticky column's inherent overlay design (same mechanism target-accounts.css already uses) rather than a further bug; whether the user wants a structurally different non-overlapping pinned column is unconfirmed.</w:t>
-      </w:r>
-    </w:p>
-    <w:p>
-      <w:pPr>
-        <w:pStyle w:val="ListBullet"/>
-      </w:pPr>
-      <w:r>
-        <w:t>Embedded-page height collapse bug fixed, 13th round of direct feedback, 2026-09-19: reported as “worse” than the kebab issue, from a full testing pass - navigating into an embedded page (e.g. Posts Dashboard embedded inside Target Accounts) collapsed the main screen into “a small scrollable area at the top,” across many nav items. Root cause: #app-shell's align-items: flex-start never actually stretches #app-main to its own min-height: 100vh - it only looked full-height because real, in-flow content was naturally tall; with that content hidden to show an embedded page instead (position: absolute, out of flow), #app-main collapsed to just its padding, and the absolutely-positioned embed wrapper collapsed with it. scanner.css's #app-main already had an explicit height (needed for its own 2-column layout) and so was unaffected; target-accounts.css/dashboard.css/settings.css did not. Fixed by adding min-height: 100vh to #app-main in all three. Verified live by manually triggering the embed DOM changes and confirming via screenshot that the embedded page now fills the full viewport.</w:t>
-      </w:r>
-    </w:p>
-    <w:p>
-      <w:pPr>
-        <w:pStyle w:val="ListBullet"/>
-      </w:pPr>
-      <w:r>
-        <w:t>Nav group order normalized across all 4 pages, 14th round of direct feedback, 2026-09-19: reported directly - “if I click on the Posts Dashboard in the side panel, the main menu changes its order and puts the Posts Dashboard first. It should not do that.” Root cause: each full-tab page's own nav put its OWN group first in its static markup (current/open), so the rest of the list reshuffled depending on which page was current - target-accounts.html happened to already define what became the de facto canonical order, so landing there never visibly moved anything, while dashboard/settings/scanner all did. Fixed by reordering every page's nav-group blocks to one fixed sequence (Target Accounts Dashboard, Target Contacts Dashboard, Posts Dashboard, Scanner, Settings, Debug test panels last) - only which group carries “open” changes now, never their relative order. Purely a markup reorder, no CSS/JS changes.</w:t>
-      </w:r>
-    </w:p>
-    <w:p>
-      <w:pPr>
-        <w:pStyle w:val="ListBullet"/>
-      </w:pPr>
-      <w:r>
-        <w:t>Posts Dashboard's Actions column rebuilt as a separate table, 15th round of direct feedback, 2026-09-19: the bigger fix for the kebab-overlap issue (chosen explicitly over a narrower-columns quick fix). Root cause of “only Posts Dashboard, not Target Accounts/Contacts”: both tables used the same position: sticky; right: 0 last column, which by design overlays whatever real column is scrolled underneath it - true for both, but dashboard.js's 16 columns are wide (150px+, table-layout: fixed) so the overlap cut off a large, noticeable chunk, while target-accounts.js's ~35 narrower, auto-sized columns made the same overlap much less noticeable. Rebuilt #table-section from one sticky-column table into a flex row of two structurally separate tables - #table-scroll-region (the only part that still scrolls horizontally) and #actions-column-wrap (fixed-width, never scrolls) - so Actions can no longer overlap real data at any scroll position, not via a CSS trick but an actual different structure (the same “frozen pane via a separate synced table” pattern spreadsheet/grid UIs use). actions removed entirely from dashboard.js's COLUMNS; renderTable() now builds both tables' rows in lockstep and syncs each row's height afterward (syncActionsColumnRowHeights) since leads' Content/Title/Priority Reason cells wrap to different heights per row and would otherwise drift the two tables out of alignment. target-accounts.css's own sticky .actions-col was left untouched - the report and chosen fix were specific to Posts Dashboard.</w:t>
-      </w:r>
-    </w:p>
-    <w:p>
-      <w:pPr>
-        <w:pStyle w:val="ListBullet"/>
-      </w:pPr>
-      <w:r>
-        <w:t>Posts Dashboard's Actions column reverted back to sticky, 16th round of direct feedback, 2026-09-19: the separate-table structure was undone the same day - reported directly, with a side-by-side screenshot comparison against Target Contacts, that it “doesn't look good... much nicer and cleaner [with sticky]. Why can't you use the same solution as with the other Dashboards?” Reverted to one table with a sticky last column (round 12's header specificity fix restored verbatim), the separate-table JS/CSS removed, and every column's default width narrowed (e.g. content 280-&gt;240, actions 150-&gt;48) closer to Target Accounts/Contacts' own narrower columns, so any overlap while actively scrolling now covers noticeably less area - the underlying sticky mechanism is unchanged and now identical to the other 2 tables.</w:t>
+        <w:t>Leads Dashboard sub-labels flattened, 11th round of direct feedback, 2026-09-19: the actual root cause of the “old version of the left main menu” report - dashboard.html's own nav group still divided its 8 action items into Scoring/Enrichment/Export sub-labels, a deliberate choice made in the 5th round specifically because Target Accounts/Target Contacts got simplified past that style while Posts Dashboard (and Settings) kept it for having more items. Reported directly: “the menu has these older version of sections... that we no longer have in the menu of Target Accounts and Target Contacts.” Fixed by flattening Leads Dashboard's own group to match (sub-label divs removed, same 8 items now flat; .nav-group-sublabel deleted from dashboard.css as now-dead code). settings.html has the same kind of sub-division and was left unchanged - flagged to the user as an open question rather than assumed into scope.</w:t>
+      </w:r>
+    </w:p>
+    <w:p>
+      <w:pPr>
+        <w:pStyle w:val="ListBullet"/>
+      </w:pPr>
+      <w:r>
+        <w:t>Kebab/Actions column sticky-header bug fixed, 12th round of direct feedback, 2026-09-19: reported with a screenshot - the Leads Dashboard table's row kebab (⋮) menu appeared positioned over the last visible column instead of to the side. Reproduced live with a synthetic copy of the table (real data needs chrome.storage, unavailable outside a loaded extension) and confirmed via getComputedStyle: the body td.actions-cell was correctly position: sticky the whole time, but the HEADER th.actions-cell computed to position: relative instead - #results-table th { position: relative; ...} (ID + element, specificity 1-0-1) was beating the sticky rule (class + element, 0-1-1), an ID always outranking any number of classes regardless of source order. With no “Actions” label pinned above the (correctly pinned) kebab buttons, they read as attached to whichever column was last visible. Same bug found and fixed proactively in target-accounts.css's .actions-col (shared by the Companies/Contacts tables, identical root cause) even though not reported there yet. Fixed by scoping both rules with their table's own id so specificity actually wins - no JS/HTML changes needed. Still open per the user's immediate follow-up: the header-label fix didn't resolve it - the kebab still visually overlays the last visible data column while scrolled, which may be the sticky column's inherent overlay design (same mechanism target-accounts.css already uses) rather than a further bug; whether the user wants a structurally different non-overlapping pinned column is unconfirmed.</w:t>
+      </w:r>
+    </w:p>
+    <w:p>
+      <w:pPr>
+        <w:pStyle w:val="ListBullet"/>
+      </w:pPr>
+      <w:r>
+        <w:t>Embedded-page height collapse bug fixed, 13th round of direct feedback, 2026-09-19: reported as “worse” than the kebab issue, from a full testing pass - navigating into an embedded page (e.g. Leads Dashboard embedded inside Target Accounts) collapsed the main screen into “a small scrollable area at the top,” across many nav items. Root cause: #app-shell's align-items: flex-start never actually stretches #app-main to its own min-height: 100vh - it only looked full-height because real, in-flow content was naturally tall; with that content hidden to show an embedded page instead (position: absolute, out of flow), #app-main collapsed to just its padding, and the absolutely-positioned embed wrapper collapsed with it. scanner.css's #app-main already had an explicit height (needed for its own 2-column layout) and so was unaffected; target-accounts.css/dashboard.css/settings.css did not. Fixed by adding min-height: 100vh to #app-main in all three. Verified live by manually triggering the embed DOM changes and confirming via screenshot that the embedded page now fills the full viewport.</w:t>
+      </w:r>
+    </w:p>
+    <w:p>
+      <w:pPr>
+        <w:pStyle w:val="ListBullet"/>
+      </w:pPr>
+      <w:r>
+        <w:t>Nav group order normalized across all 4 pages, 14th round of direct feedback, 2026-09-19: reported directly - “if I click on the Leads Dashboard in the side panel, the main menu changes its order and puts the Leads Dashboard first. It should not do that.” Root cause: each full-tab page's own nav put its OWN group first in its static markup (current/open), so the rest of the list reshuffled depending on which page was current - target-accounts.html happened to already define what became the de facto canonical order, so landing there never visibly moved anything, while dashboard/settings/scanner all did. Fixed by reordering every page's nav-group blocks to one fixed sequence (Target Accounts Dashboard, Target Contacts Dashboard, Leads Dashboard, Scanner, Settings, Debug test panels last) - only which group carries “open” changes now, never their relative order. Purely a markup reorder, no CSS/JS changes.</w:t>
+      </w:r>
+    </w:p>
+    <w:p>
+      <w:pPr>
+        <w:pStyle w:val="ListBullet"/>
+      </w:pPr>
+      <w:r>
+        <w:t>Leads Dashboard's Actions column rebuilt as a separate table, 15th round of direct feedback, 2026-09-19: the bigger fix for the kebab-overlap issue (chosen explicitly over a narrower-columns quick fix). Root cause of “only Leads Dashboard, not Target Accounts/Contacts”: both tables used the same position: sticky; right: 0 last column, which by design overlays whatever real column is scrolled underneath it - true for both, but dashboard.js's 16 columns are wide (150px+, table-layout: fixed) so the overlap cut off a large, noticeable chunk, while target-accounts.js's ~35 narrower, auto-sized columns made the same overlap much less noticeable. Rebuilt #table-section from one sticky-column table into a flex row of two structurally separate tables - #table-scroll-region (the only part that still scrolls horizontally) and #actions-column-wrap (fixed-width, never scrolls) - so Actions can no longer overlap real data at any scroll position, not via a CSS trick but an actual different structure (the same “frozen pane via a separate synced table” pattern spreadsheet/grid UIs use). actions removed entirely from dashboard.js's COLUMNS; renderTable() now builds both tables' rows in lockstep and syncs each row's height afterward (syncActionsColumnRowHeights) since leads' Content/Title/Priority Reason cells wrap to different heights per row and would otherwise drift the two tables out of alignment. target-accounts.css's own sticky .actions-col was left untouched - the report and chosen fix were specific to Leads Dashboard.</w:t>
+      </w:r>
+    </w:p>
+    <w:p>
+      <w:pPr>
+        <w:pStyle w:val="ListBullet"/>
+      </w:pPr>
+      <w:r>
+        <w:t>Leads Dashboard's Actions column reverted back to sticky, 16th round of direct feedback, 2026-09-19: the separate-table structure was undone the same day - reported directly, with a side-by-side screenshot comparison against Target Contacts, that it “doesn't look good... much nicer and cleaner [with sticky]. Why can't you use the same solution as with the other Dashboards?” Reverted to one table with a sticky last column (round 12's header specificity fix restored verbatim), the separate-table JS/CSS removed, and every column's default width narrowed (e.g. content 280-&gt;240, actions 150-&gt;48) closer to Target Accounts/Contacts' own narrower columns, so any overlap while actively scrolling now covers noticeably less area - the underlying sticky mechanism is unchanged and now identical to the other 2 tables.</w:t>
       </w:r>
     </w:p>
     <w:p>
@@ -2737,7 +2737,7 @@
         <w:pStyle w:val="ListBullet"/>
       </w:pPr>
       <w:r>
-        <w:t>Posts Dashboard's Actions column rebuilt to actually mirror target-accounts.js, 18th round of direct feedback, 2026-09-19: reported with precision - “only in the Posts Dashboard, the Kebabs have a column header called Action[s]... still overlapping the last column... and there is no Scroll slide at the top of the table... this is telling me that the code is not re-using common components.” Root cause: dashboard.js had “actions” as just another entry in the shared COLUMNS array (a label, a resize handle) - target-accounts.js never did, building it entirely separately as a bare, unlabeled, hardcoded-40px column after the real columns. Fixed by actually converting to that same shape, and added the missing top scrollbar (#table-scroll-top, mirroring target-accounts.html's own mechanism) that dashboard.html never had.</w:t>
+        <w:t>Leads Dashboard's Actions column rebuilt to actually mirror target-accounts.js, 18th round of direct feedback, 2026-09-19: reported with precision - “only in the Leads Dashboard, the Kebabs have a column header called Action[s]... still overlapping the last column... and there is no Scroll slide at the top of the table... this is telling me that the code is not re-using common components.” Root cause: dashboard.js had “actions” as just another entry in the shared COLUMNS array (a label, a resize handle) - target-accounts.js never did, building it entirely separately as a bare, unlabeled, hardcoded-40px column after the real columns. Fixed by actually converting to that same shape, and added the missing top scrollbar (#table-scroll-top, mirroring target-accounts.html's own mechanism) that dashboard.html never had.</w:t>
       </w:r>
     </w:p>
     <w:p>
@@ -2761,7 +2761,7 @@
         <w:pStyle w:val="ListBullet"/>
       </w:pPr>
       <w:r>
-        <w:t>Posts Dashboard kebab header white-box fixed + missing nav self-item added, 2026-09-19: the sticky column's own background: #fff (needed on the body cell only) was also landing on the header cell at higher specificity than the shared header background, breaking its blue tint - split the rule so only the body cell gets it. Also added #open-posts-dashboard-self-btn (“Posts Dashboard”) as the first item in its own nav group, matching Target Accounts' own self-referential tab - reported directly, there was no findable way back to Posts Dashboard's own content once something else was embedded over it.</w:t>
+        <w:t>Leads Dashboard kebab header white-box fixed + missing nav self-item added, 2026-09-19: the sticky column's own background: #fff (needed on the body cell only) was also landing on the header cell at higher specificity than the shared header background, breaking its blue tint - split the rule so only the body cell gets it. Also added #open-posts-dashboard-self-btn (“Leads Dashboard”) as the first item in its own nav group, matching Target Accounts' own self-referential tab - reported directly, there was no findable way back to Leads Dashboard's own content once something else was embedded over it.</w:t>
       </w:r>
     </w:p>
     <w:p>
@@ -2801,7 +2801,7 @@
         <w:pStyle w:val="ListBullet"/>
       </w:pPr>
       <w:r>
-        <w:t>Every nav group now shows its full, real item list everywhere - a real design change, 2026-09-19: “I do not care which screen is now in the middle. If I have a sub-menu open, it must show all entries, not only 1. This was never designed to hide entries based on what screen is active” - then, on scope: “it should do what I meant it to do..., even if my main central tab is pointing to a completely different sub-menu.” Scanner and Settings groups needed no work (already fully duplicated with working per-item behavior since rounds 6-7). dashboard.html/settings.html/scanner.html's own copies of “Target Accounts Dashboard”/“Target Contacts Dashboard” now include the same dialog-opening actions target-accounts.html's native copy has; target-accounts.html/settings.html/scanner.html's own copies of “Posts Dashboard” now include the same 8 real actions dashboard.html's native copy has. Each item embeds the target page with #action=X; new openActionFromHash() (target-accounts.js) and runActionFromHash() (dashboard.js) auto-trigger the matching dialog/button on arrival, layered on top of each page's existing hash handling (verified no collision). Two items deliberately left out, flagged rather than silently skipped: “Import/Export Target Accounts…” - a native OS file picker can only open from inside a real, synchronous user click, which browsers block from firing after an async page load; there's no way around this constraint.</w:t>
+        <w:t>Every nav group now shows its full, real item list everywhere - a real design change, 2026-09-19: “I do not care which screen is now in the middle. If I have a sub-menu open, it must show all entries, not only 1. This was never designed to hide entries based on what screen is active” - then, on scope: “it should do what I meant it to do..., even if my main central tab is pointing to a completely different sub-menu.” Scanner and Settings groups needed no work (already fully duplicated with working per-item behavior since rounds 6-7). dashboard.html/settings.html/scanner.html's own copies of “Target Accounts Dashboard”/“Target Contacts Dashboard” now include the same dialog-opening actions target-accounts.html's native copy has; target-accounts.html/settings.html/scanner.html's own copies of “Leads Dashboard” now include the same 8 real actions dashboard.html's native copy has. Each item embeds the target page with #action=X; new openActionFromHash() (target-accounts.js) and runActionFromHash() (dashboard.js) auto-trigger the matching dialog/button on arrival, layered on top of each page's existing hash handling (verified no collision). Two items deliberately left out, flagged rather than silently skipped: “Import/Export Target Accounts…” - a native OS file picker can only open from inside a real, synchronous user click, which browsers block from firing after an async page load; there's no way around this constraint.</w:t>
       </w:r>
     </w:p>
     <w:p>
@@ -2841,15 +2841,15 @@
         <w:pStyle w:val="ListBullet"/>
       </w:pPr>
       <w:r>
-        <w:t>“Re-score All Priorities only works once,” 2026-09-19: reported directly - “unless I click on Open Posts Dashboard again, which seems to reset/unfreeze it... only happens with this specific action.” Root cause: a third real browser quirk - re-clicking the same action nav item twice sets the iframe's src to a URL IDENTICAL to what it already has, and an identical src assignment is a total no-op (no navigation, not even a hashchange), so neither init() nor the hashchange listener get a second chance to re-fire the action. “Open Posts Dashboard” only ever “fixed” it by accident, since its hash always differs from the last action triggered. Fixed in all 4 host files' showEmbeddedPage(): when the requested URL matches the iframe's current src, bounce through about:blank first, forcing a genuinely fresh navigation every time.</w:t>
-      </w:r>
-    </w:p>
-    <w:p>
-      <w:pPr>
-        <w:pStyle w:val="ListBullet"/>
-      </w:pPr>
-      <w:r>
-        <w:t>“3 vertical scroll bars at the same time,” 2026-09-19: reported directly, with a screenshot - “the left one moves only the menu, 2nd one, inner one, only moves the central tab, and the outer one which move both menu and central tab.” Investigated live (local static server + injected JS measurement, bypassing the usual chrome.*-API gap) rather than guessed at. Root cause #1: body in target-accounts.css/dashboard.css still carried a leftover, pre-Phase-10 padding: 24px 32px 60px duplicating #app-main's own equivalent padding - stacking silently inflated &lt;body&gt; 84px past the one-viewport #app-shell, forcing a permanent outer/document scrollbar regardless of actual content height (settings.css/scanner.css never had this duplicate, which is why only Target Accounts/Contacts and Posts Dashboard showed it). Root cause #2: #app-nav's own scroll plus its position: sticky interacting with that outer scrollbar produced two visually distinct phases (nav pinned while only main content moves, then nav joining the scroll once room ran out) - read as 2 separate bars. The user's own stated ideal became the fix's spec: “the inner vertical scroll is often needed when we have a Dashboard in the central tab... The problem is with the outer vertical scroll... it should not appear at all.” Fixed properly: removed body's duplicate padding (folded into #app-main's own padding instead, matching settings.css's already-correct pattern, zero visual change); #app-shell (target-accounts.css/dashboard.css/settings.css) changed from min-height: 100vh to a hard height: 100vh; overflow: hidden; #app-main now stretches to fill it and owns its own overflow-y: auto - a real, independent scroll region mirroring #app-nav's. Verified with a stress test (synthetic 2000px/3000px content in both nav and main) confirming each scrolls independently while the outer document never overflows under any tested condition.</w:t>
+        <w:t>“Re-score All Priorities only works once,” 2026-09-19: reported directly - “unless I click on Open Leads Dashboard again, which seems to reset/unfreeze it... only happens with this specific action.” Root cause: a third real browser quirk - re-clicking the same action nav item twice sets the iframe's src to a URL IDENTICAL to what it already has, and an identical src assignment is a total no-op (no navigation, not even a hashchange), so neither init() nor the hashchange listener get a second chance to re-fire the action. “Open Leads Dashboard” only ever “fixed” it by accident, since its hash always differs from the last action triggered. Fixed in all 4 host files' showEmbeddedPage(): when the requested URL matches the iframe's current src, bounce through about:blank first, forcing a genuinely fresh navigation every time.</w:t>
+      </w:r>
+    </w:p>
+    <w:p>
+      <w:pPr>
+        <w:pStyle w:val="ListBullet"/>
+      </w:pPr>
+      <w:r>
+        <w:t>“3 vertical scroll bars at the same time,” 2026-09-19: reported directly, with a screenshot - “the left one moves only the menu, 2nd one, inner one, only moves the central tab, and the outer one which move both menu and central tab.” Investigated live (local static server + injected JS measurement, bypassing the usual chrome.*-API gap) rather than guessed at. Root cause #1: body in target-accounts.css/dashboard.css still carried a leftover, pre-Phase-10 padding: 24px 32px 60px duplicating #app-main's own equivalent padding - stacking silently inflated &lt;body&gt; 84px past the one-viewport #app-shell, forcing a permanent outer/document scrollbar regardless of actual content height (settings.css/scanner.css never had this duplicate, which is why only Target Accounts/Contacts and Leads Dashboard showed it). Root cause #2: #app-nav's own scroll plus its position: sticky interacting with that outer scrollbar produced two visually distinct phases (nav pinned while only main content moves, then nav joining the scroll once room ran out) - read as 2 separate bars. The user's own stated ideal became the fix's spec: “the inner vertical scroll is often needed when we have a Dashboard in the central tab... The problem is with the outer vertical scroll... it should not appear at all.” Fixed properly: removed body's duplicate padding (folded into #app-main's own padding instead, matching settings.css's already-correct pattern, zero visual change); #app-shell (target-accounts.css/dashboard.css/settings.css) changed from min-height: 100vh to a hard height: 100vh; overflow: hidden; #app-main now stretches to fill it and owns its own overflow-y: auto - a real, independent scroll region mirroring #app-nav's. Verified with a stress test (synthetic 2000px/3000px content in both nav and main) confirming each scrolls independently while the outer document never overflows under any tested condition.</w:t>
       </w:r>
     </w:p>
     <w:p>
@@ -2956,7 +2956,7 @@
     </w:p>
     <w:p>
       <w:r>
-        <w:t>See RELEASE_NOTES.md for the full, dated changelog. Current version: 1.2.0.44.</w:t>
+        <w:t>See RELEASE_NOTES.md for the full, dated changelog. Current version: 1.2.0.45.</w:t>
       </w:r>
     </w:p>
     <w:sectPr>

</xml_diff>

<commit_message>
1.2.0.46: Leads Prioritization reorganized into Posts and Job ads; the Job ads' 0-100 threshold becomes a Very High/High/Medium/Low level (default High), workbook rating else SalesTeam Priority, so web/LinkedIn accounts count; Confirm shows the level
Co-Authored-By: Claude Opus 5.5 <noreply@anthropic.com>
</commit_message>
<xml_diff>
--- a/PRD.docx
+++ b/PRD.docx
@@ -2149,6 +2149,14 @@
       </w:r>
     </w:p>
     <w:p>
+      <w:pPr>
+        <w:pStyle w:val="ListBullet"/>
+      </w:pPr>
+      <w:r>
+        <w:t>Leads Prioritization - the step opens with one general explanation, then Posts (rules you build) and Job ads (two fixed rules) as two parts. The Job ads' 0-100 confidence threshold became a level the user picks (Very High / High / Medium / Low, default High; key jobRulesMinConfidence). An account's level is its workbook rating, else SalesTeam's own Priority (P1 Very High ... P4-P5 Low), so web and LinkedIn accounts count too (accountConfidenceRank, evaluateTargetAccountMatch). The numeric threshold remains only inside company prioritization (hasSufficientImportEvidence).</w:t>
+      </w:r>
+    </w:p>
+    <w:p>
       <w:r>
         <w:rPr>
           <w:b/>
@@ -2956,7 +2964,7 @@
     </w:p>
     <w:p>
       <w:r>
-        <w:t>See RELEASE_NOTES.md for the full, dated changelog. Current version: 1.2.0.45.</w:t>
+        <w:t>See RELEASE_NOTES.md for the full, dated changelog. Current version: 1.2.0.46.</w:t>
       </w:r>
     </w:p>
     <w:sectPr>

</xml_diff>

<commit_message>
1.2.0.51: Setup has 12 steps - Discovery Prioritization, Leads Prioritization and Company aliases move to Change Settings > Advanced (with How to handle research findings and Revenue & Currency); Finish asks how research findings are handled, rules under Advanced settings
Co-Authored-By: Claude Opus 5.5 <noreply@anthropic.com>
</commit_message>
<xml_diff>
--- a/PRD.docx
+++ b/PRD.docx
@@ -2137,7 +2137,7 @@
         <w:pStyle w:val="ListBullet"/>
       </w:pPr>
       <w:r>
-        <w:t>New steps - Initiative stages (ranked, at least one ticked), Companies to include (Name, website - the exclusion list wins), How big is your list (accounts, contacts per account, initiatives per account) with a live cost-and-time estimate from onboarding-estimate.js, measured averages replacing the defaults after 20 accounts. 15 steps in all.</w:t>
+        <w:t>New steps - Initiative stages (ranked, at least one ticked), Companies to include (Name, website - the exclusion list wins), How big is your list (accounts, contacts per account, initiatives per account) with a live cost-and-time estimate from onboarding-estimate.js, measured averages replacing the defaults after 20 accounts. 12 steps in the first Setup since 1.2.0.51: Discovery Prioritization, Leads Prioritization and Company aliases moved to Change Settings &gt; Advanced (defaults apply), and technical detail inside a step sits behind an Advanced settings link. Finish asks how research findings are handled (decide where safe, or ask about every difference - askEveryDifference).</w:t>
       </w:r>
     </w:p>
     <w:p>
@@ -2964,7 +2964,7 @@
     </w:p>
     <w:p>
       <w:r>
-        <w:t>See RELEASE_NOTES.md for the full, dated changelog. Current version: 1.2.0.50.</w:t>
+        <w:t>See RELEASE_NOTES.md for the full, dated changelog. Current version: 1.2.0.51.</w:t>
       </w:r>
     </w:p>
     <w:sectPr>

</xml_diff>

<commit_message>
1.2.1: release - release notes and PRD 6.22 carry the 1.2.0.52-1.2.0.64 fixes; docx regenerated; version 1.2.1
Co-Authored-By: Claude Opus 5.5 <noreply@anthropic.com>
</commit_message>
<xml_diff>
--- a/PRD.docx
+++ b/PRD.docx
@@ -2121,7 +2121,15 @@
         <w:pStyle w:val="ListBullet"/>
       </w:pPr>
       <w:r>
-        <w:t>About you - a new first step: company, website, language. Research my company (about US$0.30, one to two minutes, a progress screen with Stop and Skip) reads the seller's website and proposes Location, Size, Industry, What you sell, Things you can offer, Ideal customer, Target contacts and Companies to exclude (setup-proposals.js, pure; proposal-ui.js). On a first setup the proposals are filled in; on an existing setup each is shown beside the current value and taken only with Use proposal.</w:t>
+        <w:t>About you - a new first step: company, website, language. Research my company (about US$0.30, under a minute, a progress screen with Stop and Skip) reads the seller's website and proposes Location, Size, Industry, What you sell, Things you can offer, Ideal customer, Target contacts and Companies to exclude (setup-proposals.js, pure; proposal-ui.js). On a first setup the proposals are filled in; on an existing setup each is shown beside the current value and taken only with Use proposal.</w:t>
+      </w:r>
+    </w:p>
+    <w:p>
+      <w:pPr>
+        <w:pStyle w:val="ListBullet"/>
+      </w:pPr>
+      <w:r>
+        <w:t>Research coverage - the research lists every offer on the resources, downloads or events page and searches for competitors on purpose (8 pages, 4 searches); fewer than five competitors triggers a short competitors-only follow-up (researchMoreCompetitors). The progress screen expects the last measured run, else 40 s. The Activity Log line counts offers kept/left out and competitors, customers and partners.</w:t>
       </w:r>
     </w:p>
     <w:p>
@@ -2178,6 +2186,22 @@
       </w:pPr>
       <w:r>
         <w:t>Usable without LinkedIn - an account with web-verified contacts counts as Usable (readiness.js); LinkedIn after the web: one name search, then the People page, stopping at the target contacts per account. The first 10 Ready are built first; the Scanner starts at 10 Ready.</w:t>
+      </w:r>
+    </w:p>
+    <w:p>
+      <w:pPr>
+        <w:pStyle w:val="ListBullet"/>
+      </w:pPr>
+      <w:r>
+        <w:t>Revenue in millions and repairing web findings - listing revenue under a unit header (“Revenue (USD millions)”) is read into plain units (prompt plus listingRevenue in discovery-filter.js); rows added before 1.2.0.61 are repaired once on the update (repairListingRevenueInMillions, Activity Log). Rule 2: when the current value is implausible, the web finding is sound and nothing is implausible with it in place, the web finding is applied instead of asked. Reasons give amounts with currency; the review dialog always shows the four size figures; revenue per employee is believable up to 1 billion.</w:t>
+      </w:r>
+    </w:p>
+    <w:p>
+      <w:pPr>
+        <w:pStyle w:val="ListBullet"/>
+      </w:pPr>
+      <w:r>
+        <w:t>After Finish - while Web Discovery runs the top bar shows it (the pipeline's idle text steps aside); its finish pop-up gives Ready x of y, the 10-Ready rule, the next step and Decisions waiting; an idle pipeline names Ready accounts, whether a scan can start and decisions waiting; accounts held for the web lane read as such, and a finished web lane kicks the pipeline.</w:t>
       </w:r>
     </w:p>
     <w:p>

</xml_diff>

<commit_message>
1.2.2.9 docs: Help, PRD and design synced with the 1.2.2.8 screens - Help 'start a team' (Choose the team folder…, New folder in OneDrive, invite, share), 'join' (invitation needed, three steps, top-bar Join…, Join Team) and Team Lead (Add member…, Cancel invitation, Make Team Lead…, Make deputy…, Close the team…); PRD 6.23 'Changed in 1.2.3' bullet, Team Admin -> Team Lead in 6.24 and the scope line, seller-research offer on Automation only; design 10a: as-built Join, D18 reversed (team folder chosen directly), steps 2-5 renumbered 1.2.2.10-13
Co-Authored-By: Claude Opus 5.5 <noreply@anthropic.com>
</commit_message>
<xml_diff>
--- a/PRD.docx
+++ b/PRD.docx
@@ -106,7 +106,7 @@
         <w:pStyle w:val="ListBullet"/>
       </w:pPr>
       <w:r>
-        <w:t>Not a full CRM. No pipeline stages beyond a simple status label, no deal value/forecasting, no team features beyond team use - since 1.2.2 a team shares its data through a OneDrive folder it owns (section 6.23); no server, no CRM-style roles beyond Team Admin.</w:t>
+        <w:t>Not a full CRM. No pipeline stages beyond a simple status label, no deal value/forecasting, no team features beyond team use - since 1.2.2 a team shares its data through a OneDrive folder it owns (section 6.23); no server, no CRM-style roles beyond Team Lead.</w:t>
       </w:r>
     </w:p>
     <w:p>
@@ -2145,7 +2145,7 @@
         <w:pStyle w:val="ListBullet"/>
       </w:pPr>
       <w:r>
-        <w:t>Offered once to existing installs - a setup finished without the research sees a one-time offer on the Settings cards and at the top of Change Settings - Research (opens About you with the research started) or No thanks (setupResearch.declinedInSettings). The action stays under Settings &gt; User Profile &gt; Open About you.</w:t>
+        <w:t>Offered once to existing installs - a setup finished without the research sees a one-time offer on Settings &gt; Automation (since 1.2.2.8 only there) - Research (opens About you with the research started) or No thanks (setupResearch.declinedInSettings). The action stays under Settings &gt; User Profile &gt; Open About you.</w:t>
       </w:r>
     </w:p>
     <w:p>
@@ -2387,6 +2387,14 @@
     </w:p>
     <w:p>
       <w:pPr>
+        <w:pStyle w:val="ListBullet"/>
+      </w:pPr>
+      <w:r>
+        <w:t>Changed in 1.2.3 (test builds 1.2.2.5+) - Team Admin is now Team Lead: one per team, decided by the team folder, with hand-over (Make Team Lead…), a deputy with the same rights (Make deputy…) and Close the team…. Joining needs an invitation: the Team Lead invites by name and e-mail (at Create or with Add member…), the members table shows Invited rows (⋮ Cancel invitation), an invitation is used once and gives the member's name, and one waiting for this person is announced in the top bar on every page (Join… opens it). Create and Join choose the team's folder itself (Chrome refuses the OneDrive folder when Windows keeps Desktop or Documents in it): Create makes a new folder inside OneDrive in Chrome's folder window, its name filling in the team name; Join chooses the shared team folder and keeps looking in it every 30 s until the invitation is there. A PC that lost its saved team state re-reads every file in the team folder and sends nothing until it has (1.2.2.9). Groups (advanced mode) and the full write-up get a section of their own when 1.2.3 is finished.</w:t>
+      </w:r>
+    </w:p>
+    <w:p>
+      <w:pPr>
         <w:pStyle w:val="Heading3"/>
       </w:pPr>
       <w:r>
@@ -2427,7 +2435,7 @@
         <w:pStyle w:val="ListBullet"/>
       </w:pPr>
       <w:r>
-        <w:t>Migration - splitCompanyLists (pure, relationships.js) moves customer / partner entries to the new list. Idempotent and flag-free; runs on update, after a full restore and after a workbook import; in a team only for the Team Admin (a member's matchers already treat leftovers correctly). Activity Log relationships_migrated and a one-time pop-up that counts the accounts and leads that really come back.</w:t>
+        <w:t>Migration - splitCompanyLists (pure, relationships.js) moves customer / partner entries to the new list. Idempotent and flag-free; runs on update, after a full restore and after a workbook import; in a team only for the Team Lead (a member's matchers already treat leftovers correctly). Activity Log relationships_migrated and a one-time pop-up that counts the accounts and leads that really come back.</w:t>
       </w:r>
     </w:p>
     <w:p>
@@ -2499,7 +2507,7 @@
         <w:pStyle w:val="ListBullet"/>
       </w:pPr>
       <w:r>
-        <w:t>⋮ Relationship… - in the account menu (list row and page, after Merge…), no team or the Team Admin only: two checkboxes and Save; ticking adds an entry from the account's LinkedIn page, name and website; unticking removes every matching entry of that category.</w:t>
+        <w:t>⋮ Relationship… - in the account menu (list row and page, after Merge…), no team or the Team Lead only: two checkboxes and Save; ticking adds an entry from the account's LinkedIn page, name and website; unticking removes every matching entry of that category.</w:t>
       </w:r>
     </w:p>
     <w:p>

</xml_diff>

<commit_message>
1.2.4 Team usage step 3: Help, PRD 6.28, release notes, listing; Edge Add-ons listing
Co-Authored-By: Claude Opus 5.5 <noreply@anthropic.com>
</commit_message>
<xml_diff>
--- a/PRD.docx
+++ b/PRD.docx
@@ -3103,6 +3103,107 @@
     </w:p>
     <w:p>
       <w:pPr>
+        <w:pStyle w:val="Heading3"/>
+      </w:pPr>
+      <w:r>
+        <w:t>6.28 Team usage and the Anthropic Usage page (v1.2.4)</w:t>
+      </w:r>
+    </w:p>
+    <w:p>
+      <w:r>
+        <w:t>1.2.4 lets the Team Lead and the deputy see what the team spends on AI: each member’s monthly total on their own Anthropic API key. The page formerly called Billing is now Anthropic Usage. The requirements (R1-R6) are in BILLING_TEAM_USAGE_REQUIREMENTS.md; the design and its decisions (D1-D9) in BILLING_TEAM_USAGE_DESIGN.md.</w:t>
+      </w:r>
+    </w:p>
+    <w:p>
+      <w:pPr>
+        <w:pStyle w:val="ListBullet"/>
+      </w:pPr>
+      <w:r>
+        <w:t>Who sees what - a member sees only their own usage. The Team Lead and the deputy also see the Team usage section. Members never see each other’s figures, in no table, log or export.</w:t>
+      </w:r>
+    </w:p>
+    <w:p>
+      <w:pPr>
+        <w:pStyle w:val="ListBullet"/>
+      </w:pPr>
+      <w:r>
+        <w:t>What a member shares - per calendar month, the estimated cost in US$ and the number of web researches, from the day of joining on (D5). Nothing about days, features, tokens or accounts. A month’s figures are never lowered, so the total since joining stays right after the 400-day limit of the count (D4). The pure module team-usage.js works them out; they are kept in teamUsageMonths (personal, not in a backup).</w:t>
+      </w:r>
+    </w:p>
+    <w:p>
+      <w:pPr>
+        <w:pStyle w:val="ListBullet"/>
+      </w:pPr>
+      <w:r>
+        <w:t>A file of its own - each member’s background worker writes members/&lt;member&gt;/usage.json to the team folder, once a minute at most and only when something changed. It is not a shared key: shared rows land in every colleague’s storage and backup (D2).</w:t>
+      </w:r>
+    </w:p>
+    <w:p>
+      <w:pPr>
+        <w:pStyle w:val="ListBullet"/>
+      </w:pPr>
+      <w:r>
+        <w:t>Encrypted for the Team Lead and the deputy - every member’s browser has one key pair (RSA-OAEP, Web Crypto; the private key cannot be exported and stays in the browser’s IndexedDB) and writes its public key to members/&lt;member&gt;/usage-key.json. The totals are encrypted with a fresh AES-GCM key that is wrapped for the Team Lead and the deputy (team-usage-seal.js, D1). The file is rewritten when the Team Lead, the deputy or one of their keys changes. This protects against a colleague who opens the file, not against one who tampers with the folder; the texts say “encrypted for the Team Lead and the deputy”, never “secure”.</w:t>
+      </w:r>
+    </w:p>
+    <w:p>
+      <w:pPr>
+        <w:pStyle w:val="ListBullet"/>
+      </w:pPr>
+      <w:r>
+        <w:t>The Team usage section - on Settings &gt; Anthropic Usage, between the totals and “Day by day”. One line per person: Member, Joined, This month, Last month, Since joining, Web researches this month, Updated; a Team total; sortable by any column. Members with the same name are one line, marked “(2 browsers)” (D3). The page asks the background worker when it opens and once a minute while it is in front (D7).</w:t>
+      </w:r>
+    </w:p>
+    <w:p>
+      <w:pPr>
+        <w:pStyle w:val="ListBullet"/>
+      </w:pPr>
+      <w:r>
+        <w:t>Members who left, older builds, hand-over - a member who left stays in the table, marked “(left)”, until the end of the following calendar year. A colleague without a usage file shows “No figures yet - needs SalesTeam 1.2.4”. The Team Lead’s browser keeps a copy of what it last read (teamUsageTable, personal), removed when the rights end. After a hand-over to someone who was not deputy, a member who had already left shows “Figures not available” (D9).</w:t>
+      </w:r>
+    </w:p>
+    <w:p>
+      <w:pPr>
+        <w:pStyle w:val="ListBullet"/>
+      </w:pPr>
+      <w:r>
+        <w:t>The member’s own page - says “on your own Anthropic API key in this browser” and, in a team, “Your Team Lead sees your monthly total and your number of web researches. Nothing else is shared.” The “Reset the counters…” button is removed.</w:t>
+      </w:r>
+    </w:p>
+    <w:p>
+      <w:pPr>
+        <w:pStyle w:val="ListBullet"/>
+      </w:pPr>
+      <w:r>
+        <w:t>Backup and restore - each browser has a random install id, written into a backup’s manifest. The usage count is its own backup category, “Usage and cost count”, offered on restore only in the browser that made the backup; from another browser or a backup made before 1.2.4 it is taken out when the file is read, and the result says so (D6).</w:t>
+      </w:r>
+    </w:p>
+    <w:p>
+      <w:pPr>
+        <w:pStyle w:val="ListBullet"/>
+      </w:pPr>
+      <w:r>
+        <w:t>Web research fixes in the same builds - a research whose request grew beyond the model’s limit (“prompt is too long”) is repeated once with web search only; a failed research is logged as an error; the top bar names the LinkedIn limit only when it was reached; the web research line says “paused for today” while automation is paused.</w:t>
+      </w:r>
+    </w:p>
+    <w:p>
+      <w:pPr>
+        <w:pStyle w:val="ListBullet"/>
+      </w:pPr>
+      <w:r>
+        <w:t>Tests - test_pure_modules.py (1,074 checks: monthly totals, never lowered, the table) and test_team_sync.py (299 checks: sealed for the Team Lead only, for both with a deputy, rewritten on change, a former deputy loses the copy, a member who left). The encryption itself was run in a real browser.</w:t>
+      </w:r>
+    </w:p>
+    <w:p>
+      <w:pPr>
+        <w:pStyle w:val="ListBullet"/>
+      </w:pPr>
+      <w:r>
+        <w:t>Not in 1.2.4 - a budget or limit per member, warnings to the Team Lead, a colleague’s days or features, official figures from Anthropic, one shared API key, an export of the table. One person as one member across browsers waits for the sign-in item; until then Help recommends one browser per person.</w:t>
+      </w:r>
+    </w:p>
+    <w:p>
+      <w:pPr>
         <w:pStyle w:val="Heading2"/>
       </w:pPr>
       <w:r>
@@ -3845,7 +3946,7 @@
     </w:p>
     <w:p>
       <w:r>
-        <w:t>See RELEASE_NOTES.md for the full, dated changelog. Current version: 1.2.3.20.</w:t>
+        <w:t>See RELEASE_NOTES.md for the full, dated changelog. Current version: 1.2.4.</w:t>
       </w:r>
     </w:p>
     <w:sectPr>

</xml_diff>

<commit_message>
1.2.4.34 audit docs: PRD 6.32, release notes v1.2.4.34, Help entries
PRD 6.32 (Removed lists, mandatory reason, Activity Log kept 12 months and exported, Leads bulk edit bar), 6.5 Bulk
edit and 6.10 retention/Export lines, mirrored in gen_docs.py; release notes v1.2.4.34; Help: bulk change and undo
reworded, new entries for Dismissed leads, restoring removed accounts/contacts and the Activity Log export; PRD.docx
and RELEASE_NOTES.docx regenerated.

Co-Authored-By: Claude Opus 5.5 <noreply@anthropic.com>
</commit_message>
<xml_diff>
--- a/PRD.docx
+++ b/PRD.docx
@@ -816,7 +816,7 @@
         <w:pStyle w:val="ListBullet"/>
       </w:pPr>
       <w:r>
-        <w:t>Bulk Change: a small, deliberately unobtrusive button (pagination row, not the main controls) opens a modal dialog — a red warning naming exactly how many currently-filtered leads will be affected, no default status pre-selected, a confirmation prompt on top of that, and an “Undo Last Bulk Change” button in the same dialog that restores every affected lead to its exact prior status (one level of undo, persists across Dashboard sessions until superseded by another bulk change). Closeable via a title-bar-style ✕.</w:t>
+        <w:t>Bulk edit (1.2.4.34: tick boxes and a bar above the table, as on Target Contacts - see 6.32): opens a modal dialog — naming how many ticked leads will be affected, no default status pre-selected, a confirmation prompt on top of that, and an “Undo Last Bulk Change” button in the same dialog that restores every affected lead to its exact prior status (one level of undo, persists across Dashboard sessions until superseded by another bulk change). Closeable via a title-bar-style ✕.</w:t>
       </w:r>
     </w:p>
     <w:p>
@@ -1023,7 +1023,7 @@
         <w:pStyle w:val="ListBullet"/>
       </w:pPr>
       <w:r>
-        <w:t>Capped at 2000 entries (oldest dropped first) - no unlimitedStorage permission is declared (5MB real chrome.storage.local quota) and nothing else in the app guards against quota exhaustion, so the log is Never manually clearable (v0.26.2) - this is the one place to investigate what happened after something looks wrong, so no action anywhere deletes it. Stored as one array per calendar day (activityLog:YYYY-MM-DD) rather than one shared array; anything older than a 90-day retention window is pruned automatically on every write - a predictable “always the last 90 days” guarantee, not a raw entry-count cap that could exhaust itself faster during a single unusually active day. Log data from the earlier flat single-key scheme migrates automatically (bucketed by each entry's own timestamp) the first time it's read.</w:t>
+        <w:t>Capped at 2000 entries (oldest dropped first) - no unlimitedStorage permission is declared (5MB real chrome.storage.local quota) and nothing else in the app guards against quota exhaustion, so the log is Never manually clearable (v0.26.2) - this is the one place to investigate what happened after something looks wrong, so no action anywhere deletes it. Stored as one array per calendar day (activityLog:YYYY-MM-DD) rather than one shared array; anything older than a 12-month retention window (90 days until 1.2.4.32) is pruned automatically - a predictable “always the last 12 months” guarantee, not a raw entry-count cap that could exhaust itself faster during a single unusually active day. Log data from the earlier flat single-key scheme migrates automatically (bucketed by each entry's own timestamp) the first time it's read.</w:t>
       </w:r>
     </w:p>
     <w:p>
@@ -3397,6 +3397,62 @@
       </w:pPr>
       <w:r>
         <w:t>Page headings, path line and tab titles - build 1.2.4.10 (Boaz). Every page’s heading and browser-tab title name the page shown, not the list it was opened from: “Account” and “Contact” on Target Accounts (tab “SalesTeam Account - Novartis”), “Lead” on the Leads Dashboard, “SalesTeam Settings → &lt;page&gt;” also in the tab, “SalesTeam Decisions”. Under the heading a path line - “Target Accounts Dashboard › Novartis”, “Target Accounts Dashboard › Novartis › Rui Costa” for a lead opened there, “Target Contacts Dashboard › &lt;contact&gt;”, “Leads Dashboard › &lt;creator&gt;” - where every level but the last is a link; it replaces the “Back to …” links, and the list’s description and its “LinkedIn company IDs resolved” line are hidden on these pages (1.2.4.11). A page opened inside another through the menu gives the tab its own title (frame-title.js). Opened on an account or contact (for example from a lead’s path line), Target Accounts no longer shows the accounts list for a few seconds first. The Follow-up due Save button wraps inside the card instead of sticking out past its right edge.</w:t>
+      </w:r>
+    </w:p>
+    <w:p>
+      <w:pPr>
+        <w:pStyle w:val="Heading3"/>
+      </w:pPr>
+      <w:r>
+        <w:t>6.32 Audit: removed lists, a reason for every removal, merge and delete, the Activity Log kept 12 months and exported (builds 1.2.4.29-1.2.4.34)</w:t>
+      </w:r>
+    </w:p>
+    <w:p>
+      <w:pPr>
+        <w:pStyle w:val="ListBullet"/>
+      </w:pPr>
+      <w:r>
+        <w:t>Removed lists - merged-away accounts and contacts are no longer listed under Removed: a merge cannot be undone (it does not record which side each contact, lead, note or field came from), and the Activity Log records it. The Removed dialog shows one kind per opening, “Removed accounts” or “Removed contacts”, with no tabs; every row in it can be restored. Build 1.2.4.29.</w:t>
+      </w:r>
+    </w:p>
+    <w:p>
+      <w:pPr>
+        <w:pStyle w:val="ListBullet"/>
+      </w:pPr>
+      <w:r>
+        <w:t>Quiet links instead of a button - the Removed… toolbar button is gone. Small grey links under the tables, next to the page controls, shown only when the count is above zero: “Removed accounts (N)” on Target Accounts, “Removed contacts (N)” on Target Contacts (new), and “Dismissed leads (N)” on the Leads Dashboard, which sets the Status filter to Dismissed (Dismissed stays a normal status in the list). In a team only the Team Lead and the deputy see the Removed links, as only they may restore. Build 1.2.4.30.</w:t>
+      </w:r>
+    </w:p>
+    <w:p>
+      <w:pPr>
+        <w:pStyle w:val="ListBullet"/>
+      </w:pPr>
+      <w:r>
+        <w:t>A reason is required - the confirm of Remove, Restore, Merge and Delete permanently of an account or contact has a Reason box (askConfirm option reason, confirm-dialog.js); the action cannot go ahead while it is empty. A single space is accepted and stored as given - deliberately giving no reason is itself on record. The reason ends the action’s Activity Log line (“ - reason: …”). Covered: Remove from the ⋮ menus and from Bulk edit, undoing a Find new accounts run, Delete permanently (⋮ menus and the Removed dialog), Restore, Find duplicates (Merge and Merge all), the Merge accounts dialog, Decisions (Merge, Remove) and Settings → Data protection. Build 1.2.4.31.</w:t>
+      </w:r>
+    </w:p>
+    <w:p>
+      <w:pPr>
+        <w:pStyle w:val="ListBullet"/>
+      </w:pPr>
+      <w:r>
+        <w:t>Activity Log kept 12 months - day buckets older than 12 months are pruned (was 90 days), long enough to serve as compliance evidence. Build 1.2.4.32.</w:t>
+      </w:r>
+    </w:p>
+    <w:p>
+      <w:pPr>
+        <w:pStyle w:val="ListBullet"/>
+      </w:pPr>
+      <w:r>
+        <w:t>Activity Log export - Export… on the Activity Log page asks for From and To dates and saves the entries of that range, oldest first, as a CSV with Date &amp; Time, Who, Action, Description, Previous Value and New Value - UTF-8 with a byte-order mark so Excel shows umlauts correctly. It holds what “Everything” shows, whatever the page’s filters. Who is the member’s team name (or “Me”), “Automatic” for SalesTeam’s own work, or the colleague’s name. Build 1.2.4.33.</w:t>
+      </w:r>
+    </w:p>
+    <w:p>
+      <w:pPr>
+        <w:pStyle w:val="ListBullet"/>
+      </w:pPr>
+      <w:r>
+        <w:t>Leads Dashboard bulk edit - tick boxes on the Leads table and a bar above it once a lead is ticked - “n leads selected”, Bulk edit…, “Select all N matching the current filter” and Clear selection - as on Target Contacts. The header box ticks the page shown. The Bulk edit dialog (status change, Undo Last Bulk Change, Delete these leads permanently…) acts on the ticked leads only; the old Bulk Change… button under the table, which acted on every filtered lead, is gone. Build 1.2.4.34 (Boaz).</w:t>
       </w:r>
     </w:p>
     <w:p>

</xml_diff>

<commit_message>
1.2.4.36 Data protection docs: PRD 6.31, release notes v1.2.4.35, Help entries
PRD 6.31 (lead retention, Delete permanently, Find a person and the PDF report, do-not-store list, team erase
records, logging without names, import wording), mirrored in gen_docs.py. Release notes: the top block is now
v1.2.4.35 with a Data protection section. Help: what SalesTeam stores and how to delete it, lead retention, a
person's request, the do-not-store list - these ship in the next build (1.2.4.35 zip is frozen without them).
PRD.docx and RELEASE_NOTES.docx regenerated.

Co-Authored-By: Claude Opus 5.5 <noreply@anthropic.com>
</commit_message>
<xml_diff>
--- a/PRD.docx
+++ b/PRD.docx
@@ -3397,6 +3397,86 @@
       </w:pPr>
       <w:r>
         <w:t>Page headings, path line and tab titles - build 1.2.4.10 (Boaz). Every page’s heading and browser-tab title name the page shown, not the list it was opened from: “Account” and “Contact” on Target Accounts (tab “SalesTeam Account - Novartis”), “Lead” on the Leads Dashboard, “SalesTeam Settings → &lt;page&gt;” also in the tab, “SalesTeam Decisions”. Under the heading a path line - “Target Accounts Dashboard › Novartis”, “Target Accounts Dashboard › Novartis › Rui Costa” for a lead opened there, “Target Contacts Dashboard › &lt;contact&gt;”, “Leads Dashboard › &lt;creator&gt;” - where every level but the last is a link; it replaces the “Back to …” links, and the list’s description and its “LinkedIn company IDs resolved” line are hidden on these pages (1.2.4.11). A page opened inside another through the menu gives the tab its own title (frame-title.js). Opened on an account or contact (for example from a lead’s path line), Target Accounts no longer shows the accounts list for a few seconds first. The Follow-up due Save button wraps inside the card instead of sticking out past its right edge.</w:t>
+      </w:r>
+    </w:p>
+    <w:p>
+      <w:pPr>
+        <w:pStyle w:val="Heading3"/>
+      </w:pPr>
+      <w:r>
+        <w:t>6.31 Data protection: lead retention, permanent delete, find a person, do-not-store list (builds 1.2.4.12-1.2.4.35)</w:t>
+      </w:r>
+    </w:p>
+    <w:p>
+      <w:pPr>
+        <w:pStyle w:val="ListBullet"/>
+      </w:pPr>
+      <w:r>
+        <w:t>Why - a customer's compliance officer asked how long LinkedIn data is kept and how it is deleted (DATA_PROTECTION_REQUIREMENTS.md, “Compliance answers - LinkedIn data handling”). Before this, Remove only hid a row and nothing was ever erased.</w:t>
+      </w:r>
+    </w:p>
+    <w:p>
+      <w:pPr>
+        <w:pStyle w:val="ListBullet"/>
+      </w:pPr>
+      <w:r>
+        <w:t>Lead retention - Settings → Data protection, “Delete leads older than” Off / 6 / 12 / 24 months, Off by default, explicit Save. Counted from the day SalesTeam found the lead (firstSeenAt, else the post date). Once a day while SalesTeam is open (backup-restore.js startAutoBackup → runLeadRetentionIfDue) older leads are deleted permanently with their notes and conversations, with one Activity Log line. Accounts and contacts are not deleted by age. In a team the value is the Team Lead’s (leadRetentionMonths, a team-wide key).</w:t>
+      </w:r>
+    </w:p>
+    <w:p>
+      <w:pPr>
+        <w:pStyle w:val="ListBullet"/>
+      </w:pPr>
+      <w:r>
+        <w:t>Delete permanently - a “Delete permanently…” item in the ⋮ menu of each contact and lead (row ⋮ = page ⋮), in the Removed contacts dialog and in the Leads bulk edit dialog. An account has no permanent delete - a company is not a person; its ⋮ has “Delete its contacts and leads permanently…” (its contacts, their leads and the leads posted from the company; the account and its own notes stay). It erases the rows, their notes, their Sales Mentor and Customer Voice conversations and the Activity Log lines that name them. One confirm says what goes, with counts, that it cannot be undone, and that older backup files still hold it. Rights as for Remove: anyone alone, the Team Lead or deputy in a team; they are not held up by a member’s assignment or edit (R2.7).</w:t>
+      </w:r>
+    </w:p>
+    <w:p>
+      <w:pPr>
+        <w:pStyle w:val="ListBullet"/>
+      </w:pPr>
+      <w:r>
+        <w:t>Find a person (Art. 15 and 17) - Settings → Data protection → Find a person: a name or a LinkedIn profile link. The result lists what SalesTeam holds about that person - contact rows, leads, notes, conversations, discovered contacts not yet added, Activity Log lines - with a tick box per person when names are shared. “Save Person's data as PDF…” opens a print-ready report (person-report.html) and the browser’s print dialog; the data is handed over through session storage and removed once read. “Delete this person's data and do not store this person again” deletes it all and puts the person on the do-not-store list.</w:t>
+      </w:r>
+    </w:p>
+    <w:p>
+      <w:pPr>
+        <w:pStyle w:val="ListBullet"/>
+      </w:pPr>
+      <w:r>
+        <w:t>Do-not-store list - holds hashes only (of the profile link, of name | company, and of the name alone for Allow again), never a name or link, plus the date and who added it (data-protection.js). Scans, contact discovery, web research and every import skip a listed person; a deleted lead’s post is remembered by a hash so a later scan skips that post (its author is not blocked). Delete permanently on a contact also lists the person; retention does not. The page shows only the count. “Allow this person again” takes someone off by entering the same name or link. Shared in a team, Team Lead or deputy only. 1.2.4.35: an import that leaves people out because of the list says so (“2 people not imported (on the do-not-store list)”).</w:t>
+      </w:r>
+    </w:p>
+    <w:p>
+      <w:pPr>
+        <w:pStyle w:val="ListBullet"/>
+      </w:pPr>
+      <w:r>
+        <w:t>Team - a permanent delete goes out as an “erase” record that names its row by a hash only and is never revived by a colleague’s later edit (team-merge.js); every member drops the rows the next time it reads the team folder, and compaction leaves them out of the snapshot. Limits, said in the confirm and the Privacy Policy: a colleague’s PC that is switched off keeps the data until SalesTeam opens there; the team folder lets go of it within about 8 days; older backup files keep it until they are deleted under the backup setting.</w:t>
+      </w:r>
+    </w:p>
+    <w:p>
+      <w:pPr>
+        <w:pStyle w:val="ListBullet"/>
+      </w:pPr>
+      <w:r>
+        <w:t>Logging - the Activity Log line of a permanent delete or a forgotten person gives counts and the reason, never the person’s name (right to be forgotten; Boaz, 2026-10-19).</w:t>
+      </w:r>
+    </w:p>
+    <w:p>
+      <w:pPr>
+        <w:pStyle w:val="ListBullet"/>
+      </w:pPr>
+      <w:r>
+        <w:t>Import wording - the import titles name the source, not an export: “Import from HubSpot”, “Import from Salesforce”, “Import from Microsoft Dynamics”; the file type lists say “HubSpot (CSV file)” and the like.</w:t>
+      </w:r>
+    </w:p>
+    <w:p>
+      <w:pPr>
+        <w:pStyle w:val="ListBullet"/>
+      </w:pPr>
+      <w:r>
+        <w:t>Tests - test_pure_modules.py (data-protection.js hashing and matching; the import summary line) and test_team_sync.py (erase records: delete then a colleague’s edit, a colleague offline, compaction, an old build catching up).</w:t>
       </w:r>
     </w:p>
     <w:p>

</xml_diff>